<commit_message>
Mis correcciones locales de informe y notebook
</commit_message>
<xml_diff>
--- a/semana1/docs/MAGÍSTER EN CIENCIA DE DATOS E INTELIGENCIA ARTIFICIAL 2.docx
+++ b/semana1/docs/MAGÍSTER EN CIENCIA DE DATOS E INTELIGENCIA ARTIFICIAL 2.docx
@@ -115,7 +115,6 @@
           <w:sz w:val="20"/>
         </w:rPr>
       </w:pPr>
-      <w:proofErr w:type="gramStart"/>
       <w:r>
         <w:rPr>
           <w:i/>
@@ -124,7 +123,6 @@
         </w:rPr>
         <w:t>Informe  grupal</w:t>
       </w:r>
-      <w:proofErr w:type="gramEnd"/>
     </w:p>
     <w:p>
       <w:pPr>
@@ -156,8 +154,6 @@
       </w:r>
       <w:r>
         <w:tab/>
-      </w:r>
-      <w:r>
         <w:t>:</w:t>
       </w:r>
       <w:r>
@@ -181,8 +177,6 @@
       </w:r>
       <w:r>
         <w:tab/>
-      </w:r>
-      <w:r>
         <w:t>:</w:t>
       </w:r>
       <w:r>
@@ -198,11 +192,9 @@
         <w:ind w:left="-15" w:firstLine="0"/>
         <w:jc w:val="left"/>
       </w:pPr>
-      <w:proofErr w:type="spellStart"/>
       <w:r>
         <w:t>Dataset</w:t>
       </w:r>
-      <w:proofErr w:type="spellEnd"/>
       <w:r>
         <w:tab/>
       </w:r>
@@ -211,16 +203,11 @@
       </w:r>
       <w:r>
         <w:tab/>
-      </w:r>
-      <w:r>
         <w:t>:</w:t>
       </w:r>
       <w:r>
         <w:tab/>
-        <w:t>Rain in Australia</w:t>
-      </w:r>
-      <w:r>
-        <w:t xml:space="preserve"> (</w:t>
+        <w:t>Rain in Australia (</w:t>
       </w:r>
       <w:r>
         <w:t>L</w:t>
@@ -251,18 +238,11 @@
       </w:r>
       <w:r>
         <w:tab/>
-      </w:r>
-      <w:r>
         <w:t>:</w:t>
       </w:r>
       <w:r>
         <w:tab/>
-      </w:r>
-      <w:r>
-        <w:t>Jean Paul Maidana G.</w:t>
-      </w:r>
-      <w:r>
-        <w:t xml:space="preserve"> Fecha</w:t>
+        <w:t>Jean Paul Maidana G. Fecha</w:t>
       </w:r>
       <w:r>
         <w:tab/>
@@ -272,14 +252,10 @@
       </w:r>
       <w:r>
         <w:tab/>
-      </w:r>
-      <w:r>
         <w:t>:</w:t>
       </w:r>
       <w:r>
         <w:tab/>
-      </w:r>
-      <w:r>
         <w:t>28/06/2026</w:t>
       </w:r>
     </w:p>
@@ -299,36 +275,33 @@
         </w:rPr>
       </w:pPr>
       <w:r>
-        <w:t>Repositorio GitHub</w:t>
-      </w:r>
-      <w:proofErr w:type="gramStart"/>
-      <w:r>
+        <w:t>Repositorio GitHu</w:t>
+      </w:r>
+      <w:r>
+        <w:rPr>
+          <w:color w:val="000000" w:themeColor="text1"/>
+        </w:rPr>
+        <w:t>b</w:t>
+      </w:r>
+      <w:r>
+        <w:rPr>
+          <w:color w:val="000000" w:themeColor="text1"/>
+        </w:rPr>
         <w:tab/>
-      </w:r>
-      <w:r>
         <w:t>:</w:t>
       </w:r>
       <w:r>
         <w:rPr>
-          <w:color w:val="FFFFFF"/>
-        </w:rPr>
-        <w:t>Información</w:t>
-      </w:r>
-      <w:proofErr w:type="gramEnd"/>
-      <w:r>
-        <w:rPr>
-          <w:color w:val="FFFFFF"/>
-        </w:rPr>
-        <w:t xml:space="preserve"> de la </w:t>
-      </w:r>
-      <w:proofErr w:type="spellStart"/>
-      <w:r>
-        <w:rPr>
-          <w:color w:val="FFFFFF"/>
-        </w:rPr>
-        <w:t>evalua</w:t>
-      </w:r>
-      <w:proofErr w:type="spellEnd"/>
+          <w:color w:val="000000" w:themeColor="text1"/>
+        </w:rPr>
+        <w:tab/>
+      </w:r>
+      <w:r>
+        <w:rPr>
+          <w:color w:val="000000" w:themeColor="text1"/>
+        </w:rPr>
+        <w:t>https://github.com/edocontreras/mcdia500-estadistica-computacional-g6</w:t>
+      </w:r>
     </w:p>
     <w:p>
       <w:pPr>
@@ -351,14 +324,12 @@
         <w:pStyle w:val="Ttulo2"/>
         <w:jc w:val="right"/>
       </w:pPr>
-      <w:bookmarkStart w:id="0" w:name="_Toc233565142"/>
-      <w:proofErr w:type="spellStart"/>
+      <w:bookmarkStart w:id="0" w:name="_Toc233745577"/>
       <w:r>
         <w:lastRenderedPageBreak/>
         <w:t>Indice</w:t>
       </w:r>
       <w:bookmarkEnd w:id="0"/>
-      <w:proofErr w:type="spellEnd"/>
     </w:p>
     <w:p>
       <w:pPr>
@@ -370,7 +341,13 @@
     <w:sdt>
       <w:sdtPr>
         <w:rPr>
+          <w:rFonts w:ascii="Calibri" w:eastAsia="Calibri" w:hAnsi="Calibri" w:cs="Calibri"/>
+          <w:color w:val="000000"/>
+          <w:kern w:val="2"/>
+          <w:sz w:val="22"/>
+          <w:szCs w:val="24"/>
           <w:lang w:val="es-ES"/>
+          <w14:ligatures w14:val="standardContextual"/>
         </w:rPr>
         <w:id w:val="-1166780794"/>
         <w:docPartObj>
@@ -380,14 +357,8 @@
       </w:sdtPr>
       <w:sdtEndPr>
         <w:rPr>
-          <w:rFonts w:ascii="Calibri" w:eastAsia="Calibri" w:hAnsi="Calibri" w:cs="Calibri"/>
           <w:b/>
           <w:bCs/>
-          <w:color w:val="000000"/>
-          <w:kern w:val="2"/>
-          <w:sz w:val="22"/>
-          <w:szCs w:val="24"/>
-          <w14:ligatures w14:val="standardContextual"/>
         </w:rPr>
       </w:sdtEndPr>
       <w:sdtContent>
@@ -424,7 +395,7 @@
           <w:r>
             <w:fldChar w:fldCharType="separate"/>
           </w:r>
-          <w:hyperlink w:anchor="_Toc233565142" w:history="1">
+          <w:hyperlink w:anchor="_Toc233745577" w:history="1">
             <w:r>
               <w:rPr>
                 <w:rStyle w:val="Hipervnculo"/>
@@ -451,7 +422,7 @@
                 <w:noProof/>
                 <w:webHidden/>
               </w:rPr>
-              <w:instrText xml:space="preserve"> PAGEREF _Toc233565142 \h </w:instrText>
+              <w:instrText xml:space="preserve"> PAGEREF _Toc233745577 \h </w:instrText>
             </w:r>
             <w:r>
               <w:rPr>
@@ -496,7 +467,7 @@
               <w:sz w:val="24"/>
             </w:rPr>
           </w:pPr>
-          <w:hyperlink w:anchor="_Toc233565143" w:history="1">
+          <w:hyperlink w:anchor="_Toc233745578" w:history="1">
             <w:r>
               <w:rPr>
                 <w:rStyle w:val="Hipervnculo"/>
@@ -539,7 +510,7 @@
                 <w:noProof/>
                 <w:webHidden/>
               </w:rPr>
-              <w:instrText xml:space="preserve"> PAGEREF _Toc233565143 \h </w:instrText>
+              <w:instrText xml:space="preserve"> PAGEREF _Toc233745578 \h </w:instrText>
             </w:r>
             <w:r>
               <w:rPr>
@@ -584,7 +555,7 @@
               <w:sz w:val="24"/>
             </w:rPr>
           </w:pPr>
-          <w:hyperlink w:anchor="_Toc233565144" w:history="1">
+          <w:hyperlink w:anchor="_Toc233745579" w:history="1">
             <w:r>
               <w:rPr>
                 <w:rStyle w:val="Hipervnculo"/>
@@ -627,7 +598,7 @@
                 <w:noProof/>
                 <w:webHidden/>
               </w:rPr>
-              <w:instrText xml:space="preserve"> PAGEREF _Toc233565144 \h </w:instrText>
+              <w:instrText xml:space="preserve"> PAGEREF _Toc233745579 \h </w:instrText>
             </w:r>
             <w:r>
               <w:rPr>
@@ -672,7 +643,7 @@
               <w:sz w:val="24"/>
             </w:rPr>
           </w:pPr>
-          <w:hyperlink w:anchor="_Toc233565145" w:history="1">
+          <w:hyperlink w:anchor="_Toc233745580" w:history="1">
             <w:r>
               <w:rPr>
                 <w:rStyle w:val="Hipervnculo"/>
@@ -715,7 +686,7 @@
                 <w:noProof/>
                 <w:webHidden/>
               </w:rPr>
-              <w:instrText xml:space="preserve"> PAGEREF _Toc233565145 \h </w:instrText>
+              <w:instrText xml:space="preserve"> PAGEREF _Toc233745580 \h </w:instrText>
             </w:r>
             <w:r>
               <w:rPr>
@@ -750,6 +721,7 @@
           <w:pPr>
             <w:pStyle w:val="TDC2"/>
             <w:tabs>
+              <w:tab w:val="left" w:pos="720"/>
               <w:tab w:val="right" w:leader="dot" w:pos="8828"/>
             </w:tabs>
             <w:rPr>
@@ -759,23 +731,39 @@
               <w:sz w:val="24"/>
             </w:rPr>
           </w:pPr>
-          <w:hyperlink w:anchor="_Toc233565146" w:history="1">
+          <w:hyperlink w:anchor="_Toc233745581" w:history="1">
             <w:r>
               <w:rPr>
                 <w:rStyle w:val="Hipervnculo"/>
                 <w:noProof/>
               </w:rPr>
-              <w:t>4. Aplicación de Pruebas de Hipótesis.</w:t>
-            </w:r>
-            <w:r>
-              <w:rPr>
-                <w:noProof/>
-                <w:webHidden/>
+              <w:t>4.</w:t>
+            </w:r>
+            <w:r>
+              <w:rPr>
+                <w:rFonts w:asciiTheme="minorHAnsi" w:eastAsiaTheme="minorEastAsia" w:hAnsiTheme="minorHAnsi" w:cstheme="minorBidi"/>
+                <w:noProof/>
+                <w:color w:val="auto"/>
+                <w:sz w:val="24"/>
               </w:rPr>
               <w:tab/>
             </w:r>
             <w:r>
               <w:rPr>
+                <w:rStyle w:val="Hipervnculo"/>
+                <w:noProof/>
+              </w:rPr>
+              <w:t>Aplicación de Pruebas de Hipótesis.</w:t>
+            </w:r>
+            <w:r>
+              <w:rPr>
+                <w:noProof/>
+                <w:webHidden/>
+              </w:rPr>
+              <w:tab/>
+            </w:r>
+            <w:r>
+              <w:rPr>
                 <w:noProof/>
                 <w:webHidden/>
               </w:rPr>
@@ -786,7 +774,7 @@
                 <w:noProof/>
                 <w:webHidden/>
               </w:rPr>
-              <w:instrText xml:space="preserve"> PAGEREF _Toc233565146 \h </w:instrText>
+              <w:instrText xml:space="preserve"> PAGEREF _Toc233745581 \h </w:instrText>
             </w:r>
             <w:r>
               <w:rPr>
@@ -830,7 +818,7 @@
               <w:sz w:val="24"/>
             </w:rPr>
           </w:pPr>
-          <w:hyperlink w:anchor="_Toc233565147" w:history="1">
+          <w:hyperlink w:anchor="_Toc233745582" w:history="1">
             <w:r>
               <w:rPr>
                 <w:rStyle w:val="Hipervnculo"/>
@@ -857,7 +845,7 @@
                 <w:noProof/>
                 <w:webHidden/>
               </w:rPr>
-              <w:instrText xml:space="preserve"> PAGEREF _Toc233565147 \h </w:instrText>
+              <w:instrText xml:space="preserve"> PAGEREF _Toc233745582 \h </w:instrText>
             </w:r>
             <w:r>
               <w:rPr>
@@ -890,9 +878,9 @@
         </w:p>
         <w:p>
           <w:pPr>
-            <w:pStyle w:val="TDC3"/>
+            <w:pStyle w:val="TDC2"/>
             <w:tabs>
-              <w:tab w:val="left" w:pos="960"/>
+              <w:tab w:val="left" w:pos="720"/>
               <w:tab w:val="right" w:leader="dot" w:pos="8828"/>
             </w:tabs>
             <w:rPr>
@@ -902,13 +890,13 @@
               <w:sz w:val="24"/>
             </w:rPr>
           </w:pPr>
-          <w:hyperlink w:anchor="_Toc233565148" w:history="1">
+          <w:hyperlink w:anchor="_Toc233745583" w:history="1">
             <w:r>
               <w:rPr>
                 <w:rStyle w:val="Hipervnculo"/>
                 <w:noProof/>
               </w:rPr>
-              <w:t>4.</w:t>
+              <w:t>5.</w:t>
             </w:r>
             <w:r>
               <w:rPr>
@@ -945,7 +933,7 @@
                 <w:noProof/>
                 <w:webHidden/>
               </w:rPr>
-              <w:instrText xml:space="preserve"> PAGEREF _Toc233565148 \h </w:instrText>
+              <w:instrText xml:space="preserve"> PAGEREF _Toc233745583 \h </w:instrText>
             </w:r>
             <w:r>
               <w:rPr>
@@ -978,8 +966,9 @@
         </w:p>
         <w:p>
           <w:pPr>
-            <w:pStyle w:val="TDC3"/>
+            <w:pStyle w:val="TDC2"/>
             <w:tabs>
+              <w:tab w:val="left" w:pos="720"/>
               <w:tab w:val="right" w:leader="dot" w:pos="8828"/>
             </w:tabs>
             <w:rPr>
@@ -989,23 +978,39 @@
               <w:sz w:val="24"/>
             </w:rPr>
           </w:pPr>
-          <w:hyperlink w:anchor="_Toc233565149" w:history="1">
+          <w:hyperlink w:anchor="_Toc233745584" w:history="1">
             <w:r>
               <w:rPr>
                 <w:rStyle w:val="Hipervnculo"/>
                 <w:noProof/>
               </w:rPr>
-              <w:t>5. Interpretación Preliminar y Conclusiones para la Toma de Decisiones</w:t>
-            </w:r>
-            <w:r>
-              <w:rPr>
-                <w:noProof/>
-                <w:webHidden/>
+              <w:t>6.</w:t>
+            </w:r>
+            <w:r>
+              <w:rPr>
+                <w:rFonts w:asciiTheme="minorHAnsi" w:eastAsiaTheme="minorEastAsia" w:hAnsiTheme="minorHAnsi" w:cstheme="minorBidi"/>
+                <w:noProof/>
+                <w:color w:val="auto"/>
+                <w:sz w:val="24"/>
               </w:rPr>
               <w:tab/>
             </w:r>
             <w:r>
               <w:rPr>
+                <w:rStyle w:val="Hipervnculo"/>
+                <w:noProof/>
+              </w:rPr>
+              <w:t>Interpretación Preliminar y Conclusiones para la Toma de Decisiones.</w:t>
+            </w:r>
+            <w:r>
+              <w:rPr>
+                <w:noProof/>
+                <w:webHidden/>
+              </w:rPr>
+              <w:tab/>
+            </w:r>
+            <w:r>
+              <w:rPr>
                 <w:noProof/>
                 <w:webHidden/>
               </w:rPr>
@@ -1016,7 +1021,7 @@
                 <w:noProof/>
                 <w:webHidden/>
               </w:rPr>
-              <w:instrText xml:space="preserve"> PAGEREF _Toc233565149 \h </w:instrText>
+              <w:instrText xml:space="preserve"> PAGEREF _Toc233745584 \h </w:instrText>
             </w:r>
             <w:r>
               <w:rPr>
@@ -1049,8 +1054,9 @@
         </w:p>
         <w:p>
           <w:pPr>
-            <w:pStyle w:val="TDC3"/>
+            <w:pStyle w:val="TDC2"/>
             <w:tabs>
+              <w:tab w:val="left" w:pos="720"/>
               <w:tab w:val="right" w:leader="dot" w:pos="8828"/>
             </w:tabs>
             <w:rPr>
@@ -1060,23 +1066,39 @@
               <w:sz w:val="24"/>
             </w:rPr>
           </w:pPr>
-          <w:hyperlink w:anchor="_Toc233565150" w:history="1">
+          <w:hyperlink w:anchor="_Toc233745585" w:history="1">
             <w:r>
               <w:rPr>
                 <w:rStyle w:val="Hipervnculo"/>
                 <w:noProof/>
               </w:rPr>
-              <w:t>6. Presentación Formal del Informe</w:t>
-            </w:r>
-            <w:r>
-              <w:rPr>
-                <w:noProof/>
-                <w:webHidden/>
+              <w:t>7.</w:t>
+            </w:r>
+            <w:r>
+              <w:rPr>
+                <w:rFonts w:asciiTheme="minorHAnsi" w:eastAsiaTheme="minorEastAsia" w:hAnsiTheme="minorHAnsi" w:cstheme="minorBidi"/>
+                <w:noProof/>
+                <w:color w:val="auto"/>
+                <w:sz w:val="24"/>
               </w:rPr>
               <w:tab/>
             </w:r>
             <w:r>
               <w:rPr>
+                <w:rStyle w:val="Hipervnculo"/>
+                <w:noProof/>
+              </w:rPr>
+              <w:t>Presentación Formal del Informe</w:t>
+            </w:r>
+            <w:r>
+              <w:rPr>
+                <w:noProof/>
+                <w:webHidden/>
+              </w:rPr>
+              <w:tab/>
+            </w:r>
+            <w:r>
+              <w:rPr>
                 <w:noProof/>
                 <w:webHidden/>
               </w:rPr>
@@ -1087,7 +1109,7 @@
                 <w:noProof/>
                 <w:webHidden/>
               </w:rPr>
-              <w:instrText xml:space="preserve"> PAGEREF _Toc233565150 \h </w:instrText>
+              <w:instrText xml:space="preserve"> PAGEREF _Toc233745585 \h </w:instrText>
             </w:r>
             <w:r>
               <w:rPr>
@@ -1107,7 +1129,7 @@
                 <w:noProof/>
                 <w:webHidden/>
               </w:rPr>
-              <w:t>8</w:t>
+              <w:t>9</w:t>
             </w:r>
             <w:r>
               <w:rPr>
@@ -1120,8 +1142,9 @@
         </w:p>
         <w:p>
           <w:pPr>
-            <w:pStyle w:val="TDC3"/>
+            <w:pStyle w:val="TDC2"/>
             <w:tabs>
+              <w:tab w:val="left" w:pos="720"/>
               <w:tab w:val="right" w:leader="dot" w:pos="8828"/>
             </w:tabs>
             <w:rPr>
@@ -1131,24 +1154,41 @@
               <w:sz w:val="24"/>
             </w:rPr>
           </w:pPr>
-          <w:hyperlink w:anchor="_Toc233565151" w:history="1">
+          <w:hyperlink w:anchor="_Toc233745586" w:history="1">
             <w:r>
               <w:rPr>
                 <w:rStyle w:val="Hipervnculo"/>
                 <w:noProof/>
                 <w:lang w:val="en-US"/>
               </w:rPr>
-              <w:t>7. Bibliografía</w:t>
-            </w:r>
-            <w:r>
-              <w:rPr>
-                <w:noProof/>
-                <w:webHidden/>
+              <w:t>8.</w:t>
+            </w:r>
+            <w:r>
+              <w:rPr>
+                <w:rFonts w:asciiTheme="minorHAnsi" w:eastAsiaTheme="minorEastAsia" w:hAnsiTheme="minorHAnsi" w:cstheme="minorBidi"/>
+                <w:noProof/>
+                <w:color w:val="auto"/>
+                <w:sz w:val="24"/>
               </w:rPr>
               <w:tab/>
             </w:r>
             <w:r>
               <w:rPr>
+                <w:rStyle w:val="Hipervnculo"/>
+                <w:noProof/>
+                <w:lang w:val="en-US"/>
+              </w:rPr>
+              <w:t>Bibliografía</w:t>
+            </w:r>
+            <w:r>
+              <w:rPr>
+                <w:noProof/>
+                <w:webHidden/>
+              </w:rPr>
+              <w:tab/>
+            </w:r>
+            <w:r>
+              <w:rPr>
                 <w:noProof/>
                 <w:webHidden/>
               </w:rPr>
@@ -1159,7 +1199,7 @@
                 <w:noProof/>
                 <w:webHidden/>
               </w:rPr>
-              <w:instrText xml:space="preserve"> PAGEREF _Toc233565151 \h </w:instrText>
+              <w:instrText xml:space="preserve"> PAGEREF _Toc233745586 \h </w:instrText>
             </w:r>
             <w:r>
               <w:rPr>
@@ -1266,7 +1306,7 @@
           <w:numId w:val="2"/>
         </w:numPr>
       </w:pPr>
-      <w:bookmarkStart w:id="1" w:name="_Toc233565143"/>
+      <w:bookmarkStart w:id="1" w:name="_Toc233745578"/>
       <w:r>
         <w:t>Introducción y Contexto del Problema</w:t>
       </w:r>
@@ -1330,21 +1370,7 @@
         <w:rPr>
           <w:color w:val="auto"/>
         </w:rPr>
-        <w:t xml:space="preserve">, el cual consolida aproximadamente 10 años de observaciones meteorológicas diarias provenientes de múltiples estaciones oficiales de la Commonwealth de Australia. El núcleo de la investigación consiste en caracterizar esta dinámica atmosférica para abordar un problema de clasificación binaria: determinar la ocurrencia o ausencia del evento de precipitación al día siguiente, representado por la variable objetivo </w:t>
-      </w:r>
-      <w:proofErr w:type="spellStart"/>
-      <w:r>
-        <w:rPr>
-          <w:color w:val="auto"/>
-        </w:rPr>
-        <w:t>RainTomorrow</w:t>
-      </w:r>
-      <w:proofErr w:type="spellEnd"/>
-      <w:r>
-        <w:rPr>
-          <w:color w:val="auto"/>
-        </w:rPr>
-        <w:t xml:space="preserve"> (</w:t>
+        <w:t>, el cual consolida aproximadamente 10 años de observaciones meteorológicas diarias provenientes de múltiples estaciones oficiales de la Commonwealth de Australia. El núcleo de la investigación consiste en caracterizar esta dinámica atmosférica para abordar un problema de clasificación binaria: determinar la ocurrencia o ausencia del evento de precipitación al día siguiente, representado por la variable objetivo RainTomorrow (</w:t>
       </w:r>
       <w:r>
         <w:rPr>
@@ -1383,7 +1409,7 @@
           <w:numId w:val="2"/>
         </w:numPr>
       </w:pPr>
-      <w:bookmarkStart w:id="2" w:name="_Toc233565144"/>
+      <w:bookmarkStart w:id="2" w:name="_Toc233745579"/>
       <w:r>
         <w:t>Aplicación de Estadística Descriptiva</w:t>
       </w:r>
@@ -1395,29 +1421,47 @@
         <w:ind w:firstLine="698"/>
       </w:pPr>
       <w:r>
-        <w:t xml:space="preserve">El conjunto de datos bajo estudio reúne una variable </w:t>
-      </w:r>
-      <w:proofErr w:type="gramStart"/>
-      <w:r>
-        <w:t>objetivo binaria</w:t>
-      </w:r>
-      <w:proofErr w:type="gramEnd"/>
-      <w:r>
-        <w:t xml:space="preserve"> (</w:t>
-      </w:r>
-      <w:proofErr w:type="spellStart"/>
-      <w:r>
-        <w:t>RainTomorrow</w:t>
-      </w:r>
-      <w:proofErr w:type="spellEnd"/>
-      <w:r>
-        <w:t>) y 22 predictores que combinan variables categóricas (dirección del viento, presencia de lluvia actual) y numéricas de naturaleza continua (temperaturas, humedad, presión, velocidad del viento). La Tabla 1 resume las medidas de tendencia central y dispersión para las variables meteorológicas continuas más críticas en el análisis termodinámico del set de datos.</w:t>
-      </w:r>
-    </w:p>
-    <w:p>
-      <w:pPr>
-        <w:ind w:firstLine="698"/>
-      </w:pPr>
+        <w:t>El conjunto de datos bajo estudio reúne una variable objetivo binaria (RainTomorrow) y 22 predictores que combinan variables categóricas (dirección del viento, presencia de lluvia actual) y numéricas de naturaleza continua (temperaturas, humedad, presión, velocidad del viento). La Tabla 1 resume las medidas de tendencia central y dispersión para las variables meteorológicas continuas más críticas en el análisis termodinámico del set de datos.</w:t>
+      </w:r>
+    </w:p>
+    <w:p>
+      <w:pPr>
+        <w:ind w:firstLine="698"/>
+      </w:pPr>
+    </w:p>
+    <w:p>
+      <w:pPr>
+        <w:ind w:firstLine="698"/>
+      </w:pPr>
+      <w:r>
+        <w:t>Para caracterizar rigurosamente las 23 variables que componen el registro histórico de la Commonwealth de Australia, el Grupo 6 estructuró una taxonomía formal según su naturaleza matemática. El conjunto de datos se compone de variables cualitativas nominales utilizadas como identificadores geográficos (Location) y de flujo (WindGustDir, WindDir9am, WindDir3pm), variables cuantitativas continuas asociadas a la física de la atmósfera (MinTemp, MaxTemp, Rainfall, Evaporation, Sunshine, Humidity9am, Humidity3pm, Pressure9am, Pressure3pm) y variables cualitativas nominales binarias que definen la presencia del fenómeno pluvial (RainToday, RainTomorrow).</w:t>
+      </w:r>
+    </w:p>
+    <w:p>
+      <w:pPr>
+        <w:ind w:firstLine="698"/>
+      </w:pPr>
+    </w:p>
+    <w:p>
+      <w:pPr>
+        <w:ind w:firstLine="698"/>
+      </w:pPr>
+      <w:r>
+        <w:t>A partir de esta segmentación, se evaluó de forma empírica la asimetría y la forma de las curvas continuas de control. La variable de presión barométrica de la tarde (Pressure3pm) presenta un comportamiento simétrico y normalizado, caracterizado por una coincidencia casi matemática entre su media (1015.26 hPa) y su mediana (1015.20 hPa). Por el contrario, la humedad relativa vespertina (Humidity3pm) exhibe un achatamiento de perfil platicúrtico</w:t>
+      </w:r>
+      <w:r>
+        <w:rPr>
+          <w:rStyle w:val="Refdenotaalpie"/>
+        </w:rPr>
+        <w:footnoteReference w:id="1"/>
+      </w:r>
+      <w:r>
+        <w:t xml:space="preserve">; debido a que la mediana (52.00%) se posiciona levemente por sobre el promedio aritmético (51.54%), se cuantifica una sutil </w:t>
+      </w:r>
+      <w:r>
+        <w:lastRenderedPageBreak/>
+        <w:t>asimetría negativa latente, reflejo de la alta densidad y acumulación de registros en los umbrales de saturación superiores que caracterizan la inestabilidad pluvial previa a una tormenta.</w:t>
+      </w:r>
     </w:p>
     <w:p>
       <w:pPr>
@@ -1427,15 +1471,23 @@
           <w:bCs/>
         </w:rPr>
       </w:pPr>
-      <w:r>
+    </w:p>
+    <w:p>
+      <w:pPr>
+        <w:ind w:firstLine="698"/>
+      </w:pPr>
+      <w:r>
+        <w:rPr>
+          <w:noProof/>
+        </w:rPr>
         <w:drawing>
-          <wp:anchor distT="0" distB="0" distL="114300" distR="114300" simplePos="0" relativeHeight="251660800" behindDoc="0" locked="0" layoutInCell="1" allowOverlap="1" wp14:anchorId="537D05E3" wp14:editId="7E57B48C">
+          <wp:anchor distT="0" distB="0" distL="114300" distR="114300" simplePos="0" relativeHeight="251660800" behindDoc="0" locked="0" layoutInCell="1" allowOverlap="1" wp14:anchorId="537D05E3" wp14:editId="6EBDFF7B">
             <wp:simplePos x="0" y="0"/>
             <wp:positionH relativeFrom="margin">
-              <wp:posOffset>0</wp:posOffset>
+              <wp:align>right</wp:align>
             </wp:positionH>
             <wp:positionV relativeFrom="margin">
-              <wp:posOffset>5215255</wp:posOffset>
+              <wp:posOffset>313538</wp:posOffset>
             </wp:positionV>
             <wp:extent cx="5612130" cy="1035685"/>
             <wp:effectExtent l="0" t="0" r="7620" b="0"/>
@@ -1478,11 +1530,6 @@
           </wp:anchor>
         </w:drawing>
       </w:r>
-    </w:p>
-    <w:p>
-      <w:pPr>
-        <w:ind w:firstLine="698"/>
-      </w:pPr>
       <w:r>
         <w:rPr>
           <w:b/>
@@ -1491,116 +1538,32 @@
         <w:t>Tabla 1:</w:t>
       </w:r>
       <w:r>
-        <w:t xml:space="preserve"> Medidas descriptivas de las variables cuantitativas críticas.</w:t>
-      </w:r>
-      <w:r>
-        <w:t xml:space="preserve"> </w:t>
-      </w:r>
-    </w:p>
-    <w:p>
-      <w:pPr>
-        <w:ind w:firstLine="698"/>
-      </w:pPr>
-      <w:r>
+        <w:t xml:space="preserve"> Medidas descriptivas de las variables cuantitativas críticas. </w:t>
+      </w:r>
+    </w:p>
+    <w:p>
+      <w:pPr>
+        <w:ind w:firstLine="698"/>
+      </w:pPr>
+    </w:p>
+    <w:p>
+      <w:pPr>
+        <w:ind w:firstLine="698"/>
+        <w:jc w:val="left"/>
         <w:rPr>
           <w:b/>
           <w:bCs/>
         </w:rPr>
-        <w:t xml:space="preserve">Nota: </w:t>
-      </w:r>
-      <w:r>
-        <w:t>Como se observa en las métricas resumidas en la Tabla 1, la inspección inicial revela que las variables barométricas, tales como la presión atmosférica a las 3:00 p.m. (</w:t>
-      </w:r>
-      <w:r>
-        <w:rPr>
-          <w:i/>
-          <w:iCs/>
-        </w:rPr>
-        <w:t>Pressure3pm</w:t>
-      </w:r>
-      <w:r>
-        <w:t>), presentan un comportamiento altamente simétrico. Esta morfología se refleja matemáticamente en la proximidad entre su media (</w:t>
-      </w:r>
-      <w:r>
-        <w:rPr>
-          <w:i/>
-          <w:iCs/>
-        </w:rPr>
-        <w:t>M</w:t>
-      </w:r>
-      <w:r>
-        <w:t xml:space="preserve"> </w:t>
-      </w:r>
-      <w:r>
-        <w:rPr>
-          <w:i/>
-          <w:iCs/>
-        </w:rPr>
-        <w:t>= 1015.25</w:t>
-      </w:r>
-      <w:r>
-        <w:t>) y su mediana (</w:t>
-      </w:r>
-      <w:proofErr w:type="spellStart"/>
-      <w:r>
-        <w:rPr>
-          <w:i/>
-          <w:iCs/>
-        </w:rPr>
-        <w:t>Mdn</w:t>
-      </w:r>
-      <w:proofErr w:type="spellEnd"/>
-      <w:r>
-        <w:t xml:space="preserve"> </w:t>
-      </w:r>
-      <w:r>
-        <w:rPr>
-          <w:i/>
-          <w:iCs/>
-        </w:rPr>
-        <w:t>= 1015.20</w:t>
-      </w:r>
-      <w:r>
-        <w:t>). En contraste, las variables de flujo, como la velocidad del viento a la misma hora (</w:t>
-      </w:r>
-      <w:r>
-        <w:rPr>
-          <w:i/>
-          <w:iCs/>
-        </w:rPr>
-        <w:t>WindSpeed3pm</w:t>
-      </w:r>
-      <w:r>
-        <w:t>), exhiben una marcada asimetría positiva (</w:t>
-      </w:r>
-      <w:r>
-        <w:rPr>
-          <w:i/>
-          <w:iCs/>
-        </w:rPr>
-        <w:t>M = 18.65</w:t>
-      </w:r>
-      <w:r>
-        <w:t xml:space="preserve">; </w:t>
-      </w:r>
-      <w:proofErr w:type="spellStart"/>
-      <w:r>
-        <w:rPr>
-          <w:i/>
-          <w:iCs/>
-        </w:rPr>
-        <w:t>Mdn</w:t>
-      </w:r>
-      <w:proofErr w:type="spellEnd"/>
-      <w:r>
-        <w:rPr>
-          <w:i/>
-          <w:iCs/>
-        </w:rPr>
-        <w:t xml:space="preserve"> = 19.00</w:t>
-      </w:r>
-      <w:r>
-        <w:t>). Este fenómeno metodológico es atribuible a la presencia de ráfagas puntuales extremas que extienden la cola de la distribución hacia el extremo derecho del espectro.</w:t>
+      </w:pPr>
+      <w:r>
+        <w:rPr>
+          <w:b/>
+          <w:bCs/>
+        </w:rPr>
+        <w:t xml:space="preserve">Nota. </w:t>
+      </w:r>
+      <w:r>
+        <w:t xml:space="preserve">Pressure3pm exhibe un comportamiento simétrico (M = 1015.26 hPa; Mdn = 1015.20 hPa). En contraste, Humidity3pm muestra una sutil asimetría negativa (M = 51.54%; Mdn = 52.00%) por acumulación de frecuencias pre-pluviales. </w:t>
       </w:r>
     </w:p>
     <w:p>
@@ -1643,80 +1606,53 @@
     <w:p>
       <w:pPr>
         <w:ind w:firstLine="698"/>
-      </w:pPr>
-      <w:r>
-        <w:lastRenderedPageBreak/>
-        <w:t>La inspección inicial revela que variables barométricas como Pressure3pm presentan un comportamiento altamente simétrico, reflejado en la proximidad matemática entre su media y su mediana. En contraste, variables de flujo como WindSpeed3pm exhiben asimetría positiva debido a ráfagas puntuales extremas que extienden la cola de la distribución hacia la derecha.</w:t>
-      </w:r>
-    </w:p>
-    <w:p>
-      <w:pPr>
-        <w:ind w:firstLine="698"/>
-      </w:pPr>
-    </w:p>
-    <w:p>
-      <w:pPr>
-        <w:ind w:firstLine="698"/>
-      </w:pPr>
-    </w:p>
-    <w:p>
-      <w:pPr>
-        <w:ind w:firstLine="698"/>
-      </w:pPr>
-      <w:r>
-        <w:rPr>
-          <w:b/>
-          <w:bCs/>
-        </w:rPr>
+        <w:jc w:val="left"/>
+      </w:pPr>
+    </w:p>
+    <w:p>
+      <w:pPr>
+        <w:ind w:firstLine="698"/>
+      </w:pPr>
+      <w:r>
+        <w:t>La inspección inicial revela que variables barométricas como Pressure3pm presentan un comportamiento altamente simétrico, reflejado en la proximidad matemática entre su media (1015.26 hPa) y su mediana (1015.20 hPa)[cite: 1311, 1315]. En contraste, las variables psicrométricas como Humidity3pm exhiben un perfil más extendido y aplanado, acumulando una mayor densidad de frecuencias hacia los umbrales superiores, lo que evidencia la saturación atmosférica previa a los frentes de mal tiempo[cite: 1315, 1331]. Este comportamiento de los predictores físicos se complementa de forma directa con la distribución de la variable objetivo que se expone a continuación[cite: 1315].</w:t>
+      </w:r>
+    </w:p>
+    <w:p>
+      <w:pPr>
+        <w:ind w:firstLine="698"/>
+      </w:pPr>
+    </w:p>
+    <w:p>
+      <w:pPr>
+        <w:ind w:firstLine="698"/>
+      </w:pPr>
+      <w:r>
         <w:t>Figura 1</w:t>
       </w:r>
-      <w:r>
-        <w:rPr>
-          <w:b/>
-          <w:bCs/>
-        </w:rPr>
-        <w:t>(a)</w:t>
-      </w:r>
-      <w:r>
-        <w:t xml:space="preserve"> </w:t>
-      </w:r>
-      <w:r>
-        <w:rPr>
-          <w:i/>
-          <w:iCs/>
-        </w:rPr>
-        <w:t xml:space="preserve">Distribución de Frecuencias Absolutas para la Variable Objetivo </w:t>
-      </w:r>
-      <w:proofErr w:type="spellStart"/>
-      <w:r>
-        <w:rPr>
-          <w:i/>
-          <w:iCs/>
-        </w:rPr>
-        <w:t>RainTomorrow</w:t>
-      </w:r>
-      <w:proofErr w:type="spellEnd"/>
-      <w:r>
-        <w:rPr>
-          <w:i/>
-          <w:iCs/>
-        </w:rPr>
-        <w:t>.</w:t>
-      </w:r>
-    </w:p>
-    <w:p>
-      <w:pPr>
-        <w:ind w:firstLine="698"/>
-      </w:pPr>
-    </w:p>
-    <w:p>
-      <w:pPr>
-        <w:ind w:firstLine="698"/>
-        <w:jc w:val="center"/>
-      </w:pPr>
-      <w:r>
+    </w:p>
+    <w:p>
+      <w:pPr>
+        <w:ind w:firstLine="698"/>
+      </w:pPr>
+      <w:r>
+        <w:t>Distribución Porcentual y de Frecuencias para la Variable Objetivo RainTomorrow.</w:t>
+      </w:r>
+    </w:p>
+    <w:p>
+      <w:pPr>
+        <w:ind w:firstLine="698"/>
+      </w:pPr>
+    </w:p>
+    <w:p>
+      <w:pPr>
+        <w:ind w:firstLine="698"/>
+      </w:pPr>
+      <w:r>
+        <w:rPr>
+          <w:noProof/>
+        </w:rPr>
         <w:drawing>
-          <wp:inline distT="0" distB="0" distL="0" distR="0" wp14:anchorId="50F04A77" wp14:editId="294AEA5A">
+          <wp:inline distT="0" distB="0" distL="0" distR="0" wp14:anchorId="35EE8759" wp14:editId="1ACB3AB9">
             <wp:extent cx="4229100" cy="2415535"/>
             <wp:effectExtent l="0" t="0" r="0" b="4445"/>
             <wp:docPr id="1588323948" name="Imagen 1"/>
@@ -1756,105 +1692,41 @@
       <w:pPr>
         <w:ind w:firstLine="698"/>
       </w:pPr>
+    </w:p>
+    <w:p>
+      <w:pPr>
+        <w:ind w:firstLine="698"/>
+      </w:pPr>
       <w:r>
         <w:rPr>
           <w:b/>
           <w:bCs/>
         </w:rPr>
-        <w:t>Nota:</w:t>
-      </w:r>
-      <w:r>
+        <w:lastRenderedPageBreak/>
+        <w:t>Nota.</w:t>
+      </w:r>
+      <w:r>
+        <w:t xml:space="preserve"> El dataset exhibe un marcado desbalance de clases (77.6% No vs. 22.4% Yes), condición climatológica típica que guiará la selección de métricas de desempeño predictivo en las etapas subsiguientes. </w:t>
+      </w:r>
+    </w:p>
+    <w:p>
+      <w:pPr>
+        <w:ind w:firstLine="698"/>
+        <w:jc w:val="left"/>
         <w:rPr>
           <w:b/>
           <w:bCs/>
         </w:rPr>
-        <w:t xml:space="preserve">  </w:t>
-      </w:r>
-      <w:r>
-        <w:t>Como se ilustra en la Figura 1, la variable objetivo exhibe un desbalance de clases típico de la climatología continental, donde la ausencia de precipitaciones (</w:t>
-      </w:r>
-      <w:r>
-        <w:rPr>
-          <w:i/>
-          <w:iCs/>
-        </w:rPr>
-        <w:t>No</w:t>
-      </w:r>
-      <w:r>
-        <w:t>) acumula aproximadamente 110,316 observaciones frente a los 31,877 registros del evento pluvial (</w:t>
-      </w:r>
-      <w:r>
-        <w:rPr>
-          <w:i/>
-          <w:iCs/>
-        </w:rPr>
-        <w:t>Yes</w:t>
-      </w:r>
-      <w:r>
-        <w:t>). Esta asimetría estructural (</w:t>
-      </w:r>
-      <w:proofErr w:type="spellStart"/>
-      <w:r>
-        <w:rPr>
-          <w:i/>
-          <w:iCs/>
-        </w:rPr>
-        <w:t>Mdn</w:t>
-      </w:r>
-      <w:proofErr w:type="spellEnd"/>
-      <w:r>
-        <w:rPr>
-          <w:i/>
-          <w:iCs/>
-        </w:rPr>
-        <w:t xml:space="preserve"> = </w:t>
-      </w:r>
+      </w:pPr>
       <w:r>
         <w:rPr>
           <w:b/>
           <w:bCs/>
-          <w:i/>
-          <w:iCs/>
-        </w:rPr>
-        <w:t>"No"</w:t>
-      </w:r>
-      <w:r>
-        <w:t>) condicionará el posterior modelamiento predictivo, exigiendo métricas de evaluación que trasciendan la exactitud global (</w:t>
-      </w:r>
-      <w:proofErr w:type="spellStart"/>
-      <w:r>
-        <w:rPr>
-          <w:i/>
-          <w:iCs/>
-        </w:rPr>
-        <w:t>accuracy</w:t>
-      </w:r>
-      <w:proofErr w:type="spellEnd"/>
-      <w:r>
-        <w:t>) para mitigar el sesgo hacia la clase mayoritaria.</w:t>
-      </w:r>
-    </w:p>
-    <w:p>
-      <w:pPr>
-        <w:ind w:firstLine="698"/>
-        <w:jc w:val="left"/>
-        <w:rPr>
-          <w:b/>
-          <w:bCs/>
-        </w:rPr>
-      </w:pPr>
-      <w:r>
-        <w:rPr>
-          <w:b/>
-          <w:bCs/>
         </w:rPr>
         <w:t>Fuente:</w:t>
       </w:r>
       <w:r>
-        <w:t xml:space="preserve"> </w:t>
-      </w:r>
-      <w:r>
-        <w:t xml:space="preserve">Adaptado de </w:t>
+        <w:t xml:space="preserve"> Adaptado de </w:t>
       </w:r>
       <w:r>
         <w:rPr>
@@ -1897,54 +1769,55 @@
           <w:bCs/>
         </w:rPr>
       </w:pPr>
+    </w:p>
+    <w:p>
+      <w:pPr>
+        <w:ind w:firstLine="698"/>
+      </w:pPr>
       <w:r>
         <w:rPr>
           <w:b/>
           <w:bCs/>
         </w:rPr>
-        <w:br w:type="page"/>
-      </w:r>
-    </w:p>
-    <w:p>
-      <w:pPr>
-        <w:ind w:firstLine="698"/>
-      </w:pPr>
+        <w:t>Figura 1(b)</w:t>
+      </w:r>
       <w:r>
         <w:rPr>
           <w:b/>
           <w:bCs/>
         </w:rPr>
-        <w:lastRenderedPageBreak/>
-        <w:t xml:space="preserve">Figura 1(b) </w:t>
-      </w:r>
-      <w:r>
-        <w:t xml:space="preserve">gráfico de barras horizontales mostrando el porcentaje de datos faltantes por variable (donde se evidencie la alta nulidad de </w:t>
-      </w:r>
-      <w:proofErr w:type="spellStart"/>
-      <w:r>
-        <w:t>Evaporation</w:t>
-      </w:r>
-      <w:proofErr w:type="spellEnd"/>
-      <w:r>
-        <w:t xml:space="preserve"> y Sunshine).</w:t>
-      </w:r>
-    </w:p>
-    <w:p>
-      <w:pPr>
-        <w:ind w:firstLine="698"/>
-      </w:pPr>
-    </w:p>
-    <w:p>
-      <w:pPr>
-        <w:ind w:firstLine="698"/>
-        <w:jc w:val="center"/>
-      </w:pPr>
-      <w:r>
+        <w:t xml:space="preserve"> </w:t>
+      </w:r>
+      <w:r>
+        <w:t>Principales Variables con Datos Faltantes en el Dataset.</w:t>
+      </w:r>
+    </w:p>
+    <w:p>
+      <w:pPr>
+        <w:ind w:firstLine="698"/>
+        <w:rPr>
+          <w:b/>
+          <w:bCs/>
+        </w:rPr>
+      </w:pPr>
+    </w:p>
+    <w:p>
+      <w:pPr>
+        <w:ind w:firstLine="698"/>
+        <w:rPr>
+          <w:b/>
+          <w:bCs/>
+        </w:rPr>
+      </w:pPr>
+      <w:r>
+        <w:rPr>
+          <w:noProof/>
+        </w:rPr>
         <w:drawing>
-          <wp:inline distT="0" distB="0" distL="0" distR="0" wp14:anchorId="6979F9BC" wp14:editId="4DFA8EF1">
-            <wp:extent cx="4657725" cy="2662988"/>
-            <wp:effectExtent l="0" t="0" r="0" b="4445"/>
-            <wp:docPr id="60895149" name="Imagen 1"/>
+          <wp:inline distT="0" distB="0" distL="0" distR="0" wp14:anchorId="48646283" wp14:editId="4E240DEF">
+            <wp:extent cx="4657143" cy="2666667"/>
+            <wp:effectExtent l="0" t="0" r="0" b="635"/>
+            <wp:docPr id="1617193409" name="Imagen 1"/>
             <wp:cNvGraphicFramePr>
               <a:graphicFrameLocks xmlns:a="http://schemas.openxmlformats.org/drawingml/2006/main" noChangeAspect="1"/>
             </wp:cNvGraphicFramePr>
@@ -1952,7 +1825,7 @@
               <a:graphicData uri="http://schemas.openxmlformats.org/drawingml/2006/picture">
                 <pic:pic xmlns:pic="http://schemas.openxmlformats.org/drawingml/2006/picture">
                   <pic:nvPicPr>
-                    <pic:cNvPr id="60895149" name=""/>
+                    <pic:cNvPr id="1617193409" name=""/>
                     <pic:cNvPicPr/>
                   </pic:nvPicPr>
                   <pic:blipFill>
@@ -1964,7 +1837,7 @@
                   <pic:spPr>
                     <a:xfrm>
                       <a:off x="0" y="0"/>
-                      <a:ext cx="4666108" cy="2667781"/>
+                      <a:ext cx="4657143" cy="2666667"/>
                     </a:xfrm>
                     <a:prstGeom prst="rect">
                       <a:avLst/>
@@ -1986,99 +1859,101 @@
           <w:b/>
           <w:bCs/>
         </w:rPr>
-        <w:t xml:space="preserve">Nota: </w:t>
-      </w:r>
-      <w:r>
-        <w:t>L</w:t>
-      </w:r>
-      <w:r>
-        <w:t xml:space="preserve">a Figura 1(b) ratifica la presencia de datos faltantes de origen instrumental, concentrados de forma crítica en variables de radiación y evaporación como Sunshine (48.0%) y </w:t>
-      </w:r>
-      <w:proofErr w:type="spellStart"/>
-      <w:r>
-        <w:t>Evaporation</w:t>
-      </w:r>
-      <w:proofErr w:type="spellEnd"/>
-      <w:r>
-        <w:t xml:space="preserve"> (43.1%), lo que justifica metodológicamente el descarte de una simulación artificial MCAR.</w:t>
+        <w:t xml:space="preserve">Nota. </w:t>
+      </w:r>
+      <w:r>
+        <w:t xml:space="preserve">La Figura 1(b) ratifica la presencia de datos faltantes de origen instrumental, concentrados de forma crítica en variables de radiación y evaporación como Sunshine (48.0%) y Evaporation (43.2%), lo que justifica metodológicamente el descarte de una simulación artificial MCAR para no alterar la estructura original de la base. </w:t>
       </w:r>
     </w:p>
     <w:p>
       <w:pPr>
         <w:ind w:firstLine="698"/>
         <w:jc w:val="left"/>
+      </w:pPr>
+      <w:r>
         <w:rPr>
           <w:b/>
           <w:bCs/>
         </w:rPr>
+        <w:t xml:space="preserve">Fuente. </w:t>
+      </w:r>
+      <w:r>
+        <w:t>Adaptado de Rain in Australia, por J. Young, 2018 (https://www.kaggle.com/datasets/jsphgfr/rain-in-australia). Diseñado computacionalmente por el Grupo 6.</w:t>
+      </w:r>
+    </w:p>
+    <w:p>
+      <w:pPr>
+        <w:ind w:firstLine="698"/>
+      </w:pPr>
+    </w:p>
+    <w:p>
+      <w:pPr>
+        <w:spacing w:after="160" w:line="278" w:lineRule="auto"/>
+        <w:ind w:left="0" w:firstLine="0"/>
+        <w:jc w:val="left"/>
+      </w:pPr>
+      <w:r>
+        <w:br w:type="page"/>
+      </w:r>
+    </w:p>
+    <w:p>
+      <w:pPr>
+        <w:ind w:firstLine="698"/>
+        <w:jc w:val="left"/>
       </w:pPr>
       <w:r>
         <w:rPr>
           <w:b/>
           <w:bCs/>
         </w:rPr>
-        <w:t>Fuente:</w:t>
-      </w:r>
-      <w:r>
-        <w:t xml:space="preserve"> Adaptado de </w:t>
-      </w:r>
-      <w:r>
-        <w:rPr>
-          <w:i/>
-          <w:iCs/>
-        </w:rPr>
-        <w:t>Rain in Australia</w:t>
-      </w:r>
-      <w:r>
-        <w:t>, por J. Young, 2018 (</w:t>
-      </w:r>
-      <w:hyperlink r:id="rId14" w:tgtFrame="_blank" w:history="1">
-        <w:r>
-          <w:rPr>
-            <w:rStyle w:val="Hipervnculo"/>
-          </w:rPr>
-          <w:t>https://www.kaggle.com/datasets/jsphgfr/rain-in-australia</w:t>
-        </w:r>
-      </w:hyperlink>
-      <w:r>
-        <w:t>). Diseñado computacionalmente por el Grupo 6.</w:t>
-      </w:r>
-    </w:p>
-    <w:p>
-      <w:pPr>
-        <w:ind w:firstLine="698"/>
-      </w:pPr>
-    </w:p>
-    <w:p>
+        <w:lastRenderedPageBreak/>
+        <w:t>Figura 2</w:t>
+      </w:r>
       <w:r>
         <w:rPr>
           <w:b/>
           <w:bCs/>
         </w:rPr>
-        <w:t>Figura 2:</w:t>
-      </w:r>
-      <w:r>
         <w:t xml:space="preserve"> </w:t>
       </w:r>
       <w:r>
-        <w:rPr>
-          <w:i/>
-          <w:iCs/>
-        </w:rPr>
-        <w:t>Distribución empírica y curvas de densidad estimadas (KDE) para (a) Presión Atmosférica a las 3:00 p.m. y (b) Humedad Relativa a las 3:00 p.m.</w:t>
-      </w:r>
-    </w:p>
-    <w:p>
-      <w:pPr>
-        <w:ind w:firstLine="698"/>
-        <w:jc w:val="center"/>
-      </w:pPr>
-      <w:r>
+        <w:t xml:space="preserve">Distribución Empírica y Curvas de Densidad Estimadas (KDE) para Variables </w:t>
+      </w:r>
+      <w:r>
+        <w:t>M</w:t>
+      </w:r>
+      <w:r>
+        <w:t>eteorológicas Críticas.</w:t>
+      </w:r>
+    </w:p>
+    <w:p>
+      <w:pPr>
+        <w:ind w:firstLine="698"/>
+        <w:jc w:val="left"/>
+        <w:rPr>
+          <w:b/>
+          <w:bCs/>
+        </w:rPr>
+      </w:pPr>
+    </w:p>
+    <w:p>
+      <w:pPr>
+        <w:ind w:firstLine="698"/>
+        <w:jc w:val="left"/>
+        <w:rPr>
+          <w:b/>
+          <w:bCs/>
+        </w:rPr>
+      </w:pPr>
+      <w:r>
+        <w:rPr>
+          <w:noProof/>
+        </w:rPr>
         <w:drawing>
-          <wp:inline distT="0" distB="0" distL="0" distR="0" wp14:anchorId="5B9CB226" wp14:editId="2CE118DA">
-            <wp:extent cx="3743325" cy="2518614"/>
-            <wp:effectExtent l="0" t="0" r="0" b="0"/>
-            <wp:docPr id="892755647" name="Imagen 1"/>
+          <wp:inline distT="0" distB="0" distL="0" distR="0" wp14:anchorId="5E269AE3" wp14:editId="1949A948">
+            <wp:extent cx="2340864" cy="1572489"/>
+            <wp:effectExtent l="0" t="0" r="2540" b="8890"/>
+            <wp:docPr id="185157709" name="Imagen 1"/>
             <wp:cNvGraphicFramePr>
               <a:graphicFrameLocks xmlns:a="http://schemas.openxmlformats.org/drawingml/2006/main" noChangeAspect="1"/>
             </wp:cNvGraphicFramePr>
@@ -2086,7 +1961,47 @@
               <a:graphicData uri="http://schemas.openxmlformats.org/drawingml/2006/picture">
                 <pic:pic xmlns:pic="http://schemas.openxmlformats.org/drawingml/2006/picture">
                   <pic:nvPicPr>
-                    <pic:cNvPr id="892755647" name=""/>
+                    <pic:cNvPr id="185157709" name=""/>
+                    <pic:cNvPicPr/>
+                  </pic:nvPicPr>
+                  <pic:blipFill>
+                    <a:blip r:embed="rId14"/>
+                    <a:stretch>
+                      <a:fillRect/>
+                    </a:stretch>
+                  </pic:blipFill>
+                  <pic:spPr>
+                    <a:xfrm>
+                      <a:off x="0" y="0"/>
+                      <a:ext cx="2357751" cy="1583833"/>
+                    </a:xfrm>
+                    <a:prstGeom prst="rect">
+                      <a:avLst/>
+                    </a:prstGeom>
+                  </pic:spPr>
+                </pic:pic>
+              </a:graphicData>
+            </a:graphic>
+          </wp:inline>
+        </w:drawing>
+      </w:r>
+      <w:r>
+        <w:rPr>
+          <w:noProof/>
+        </w:rPr>
+        <w:drawing>
+          <wp:inline distT="0" distB="0" distL="0" distR="0" wp14:anchorId="7E6DF6C1" wp14:editId="58D2E57B">
+            <wp:extent cx="2544154" cy="1635988"/>
+            <wp:effectExtent l="0" t="0" r="8890" b="2540"/>
+            <wp:docPr id="443741145" name="Imagen 1"/>
+            <wp:cNvGraphicFramePr>
+              <a:graphicFrameLocks xmlns:a="http://schemas.openxmlformats.org/drawingml/2006/main" noChangeAspect="1"/>
+            </wp:cNvGraphicFramePr>
+            <a:graphic xmlns:a="http://schemas.openxmlformats.org/drawingml/2006/main">
+              <a:graphicData uri="http://schemas.openxmlformats.org/drawingml/2006/picture">
+                <pic:pic xmlns:pic="http://schemas.openxmlformats.org/drawingml/2006/picture">
+                  <pic:nvPicPr>
+                    <pic:cNvPr id="443741145" name=""/>
                     <pic:cNvPicPr/>
                   </pic:nvPicPr>
                   <pic:blipFill>
@@ -2098,7 +2013,7 @@
                   <pic:spPr>
                     <a:xfrm>
                       <a:off x="0" y="0"/>
-                      <a:ext cx="3750109" cy="2523178"/>
+                      <a:ext cx="2569109" cy="1652035"/>
                     </a:xfrm>
                     <a:prstGeom prst="rect">
                       <a:avLst/>
@@ -2114,45 +2029,129 @@
     <w:p>
       <w:pPr>
         <w:ind w:firstLine="698"/>
-      </w:pPr>
-      <w:r>
+        <w:jc w:val="left"/>
         <w:rPr>
           <w:b/>
           <w:bCs/>
         </w:rPr>
-        <w:t>Figura 2 (a):</w:t>
-      </w:r>
-      <w:r>
-        <w:t xml:space="preserve"> El histograma con KDE (</w:t>
-      </w:r>
-      <w:proofErr w:type="spellStart"/>
-      <w:proofErr w:type="gramStart"/>
-      <w:r>
-        <w:t>sns.histplot</w:t>
-      </w:r>
-      <w:proofErr w:type="spellEnd"/>
-      <w:proofErr w:type="gramEnd"/>
-      <w:r>
-        <w:t>) de la presión vespertina (Pressure3pm) evidenciando su comportamiento casi perfectamente gaussiano (normal).</w:t>
-      </w:r>
-    </w:p>
-    <w:p>
-      <w:pPr>
-        <w:ind w:firstLine="698"/>
-      </w:pPr>
-    </w:p>
-    <w:p>
-      <w:pPr>
-        <w:ind w:firstLine="698"/>
-        <w:jc w:val="center"/>
-      </w:pPr>
-      <w:r>
-        <w:lastRenderedPageBreak/>
+      </w:pPr>
+    </w:p>
+    <w:p>
+      <w:pPr>
+        <w:ind w:firstLine="698"/>
+        <w:jc w:val="left"/>
+      </w:pPr>
+      <w:r>
+        <w:rPr>
+          <w:b/>
+          <w:bCs/>
+        </w:rPr>
+        <w:t xml:space="preserve">Nota. </w:t>
+      </w:r>
+      <w:r>
+        <w:t xml:space="preserve">El panel (a) detalla la presión vespertina (Pressure3pm), evidenciando una morfología simétrica y acampanada de perfil casi perfectamente gaussiano (M = 1015.26 hPa). El panel (b) expone la humedad relativa (Humidity3pm), caracterizada por un comportamiento platicúrtico y extendido (M = 51.54%) con acumulación de frecuencias en los extremos altos, patrón típico de la saturación atmosférica previa a la inestabilidad pluvial. </w:t>
+      </w:r>
+    </w:p>
+    <w:p>
+      <w:pPr>
+        <w:ind w:firstLine="698"/>
+        <w:jc w:val="left"/>
+        <w:rPr>
+          <w:b/>
+          <w:bCs/>
+        </w:rPr>
+      </w:pPr>
+    </w:p>
+    <w:p>
+      <w:pPr>
+        <w:ind w:firstLine="698"/>
+        <w:jc w:val="left"/>
+      </w:pPr>
+      <w:r>
+        <w:rPr>
+          <w:b/>
+          <w:bCs/>
+        </w:rPr>
+        <w:t>Fuente:</w:t>
+      </w:r>
+      <w:r>
+        <w:t xml:space="preserve"> Adaptado de </w:t>
+      </w:r>
+      <w:r>
+        <w:rPr>
+          <w:i/>
+          <w:iCs/>
+        </w:rPr>
+        <w:t>Rain in Australia</w:t>
+      </w:r>
+      <w:r>
+        <w:t>, por J. Young, 2018 (</w:t>
+      </w:r>
+      <w:hyperlink r:id="rId16" w:tgtFrame="_blank" w:history="1">
+        <w:r>
+          <w:rPr>
+            <w:rStyle w:val="Hipervnculo"/>
+          </w:rPr>
+          <w:t>https://www.kaggle.com/datasets/jsphgfr/rain-in-australia</w:t>
+        </w:r>
+      </w:hyperlink>
+      <w:r>
+        <w:t>). Diseñado computacionalmente por el Grupo 6.</w:t>
+      </w:r>
+    </w:p>
+    <w:p>
+      <w:pPr>
+        <w:ind w:firstLine="698"/>
+        <w:jc w:val="left"/>
+        <w:rPr>
+          <w:b/>
+          <w:bCs/>
+        </w:rPr>
+      </w:pPr>
+    </w:p>
+    <w:p>
+      <w:pPr>
+        <w:spacing w:after="160" w:line="278" w:lineRule="auto"/>
+        <w:ind w:left="0" w:firstLine="0"/>
+        <w:jc w:val="left"/>
+      </w:pPr>
+      <w:r>
+        <w:rPr>
+          <w:b/>
+          <w:bCs/>
+        </w:rPr>
+        <w:t>Figura 3</w:t>
+      </w:r>
+      <w:r>
+        <w:rPr>
+          <w:b/>
+          <w:bCs/>
+        </w:rPr>
+        <w:t xml:space="preserve"> </w:t>
+      </w:r>
+      <w:r>
+        <w:t>Matriz de Coeficientes de Correlación de Pearson para Predictores y Variable Objetivo.</w:t>
+      </w:r>
+    </w:p>
+    <w:p>
+      <w:pPr>
+        <w:spacing w:after="160" w:line="278" w:lineRule="auto"/>
+        <w:ind w:left="0" w:firstLine="0"/>
+        <w:jc w:val="left"/>
+        <w:rPr>
+          <w:b/>
+          <w:bCs/>
+        </w:rPr>
+      </w:pPr>
+      <w:r>
+        <w:rPr>
+          <w:noProof/>
+        </w:rPr>
         <w:drawing>
-          <wp:inline distT="0" distB="0" distL="0" distR="0" wp14:anchorId="0AACF478" wp14:editId="53DE6513">
-            <wp:extent cx="3762375" cy="2420646"/>
-            <wp:effectExtent l="0" t="0" r="0" b="0"/>
-            <wp:docPr id="852211715" name="Imagen 1"/>
+          <wp:inline distT="0" distB="0" distL="0" distR="0" wp14:anchorId="7F7A5BD9" wp14:editId="1422953C">
+            <wp:extent cx="3238095" cy="2514286"/>
+            <wp:effectExtent l="0" t="0" r="635" b="635"/>
+            <wp:docPr id="2049550437" name="Imagen 1"/>
             <wp:cNvGraphicFramePr>
               <a:graphicFrameLocks xmlns:a="http://schemas.openxmlformats.org/drawingml/2006/main" noChangeAspect="1"/>
             </wp:cNvGraphicFramePr>
@@ -2160,11 +2159,11 @@
               <a:graphicData uri="http://schemas.openxmlformats.org/drawingml/2006/picture">
                 <pic:pic xmlns:pic="http://schemas.openxmlformats.org/drawingml/2006/picture">
                   <pic:nvPicPr>
-                    <pic:cNvPr id="852211715" name=""/>
+                    <pic:cNvPr id="2049550437" name=""/>
                     <pic:cNvPicPr/>
                   </pic:nvPicPr>
                   <pic:blipFill>
-                    <a:blip r:embed="rId16"/>
+                    <a:blip r:embed="rId17"/>
                     <a:stretch>
                       <a:fillRect/>
                     </a:stretch>
@@ -2172,7 +2171,7 @@
                   <pic:spPr>
                     <a:xfrm>
                       <a:off x="0" y="0"/>
-                      <a:ext cx="3768746" cy="2424745"/>
+                      <a:ext cx="3238095" cy="2514286"/>
                     </a:xfrm>
                     <a:prstGeom prst="rect">
                       <a:avLst/>
@@ -2187,7 +2186,8 @@
     </w:p>
     <w:p>
       <w:pPr>
-        <w:ind w:firstLine="698"/>
+        <w:spacing w:after="160" w:line="278" w:lineRule="auto"/>
+        <w:ind w:left="0" w:firstLine="0"/>
         <w:jc w:val="left"/>
       </w:pPr>
       <w:r>
@@ -2195,17 +2195,32 @@
           <w:b/>
           <w:bCs/>
         </w:rPr>
-        <w:t>Figura 2 (b):</w:t>
-      </w:r>
-      <w:r>
-        <w:t xml:space="preserve"> </w:t>
-      </w:r>
-      <w:r>
-        <w:t>H</w:t>
-      </w:r>
-      <w:r>
-        <w:t>istograma con KDE de la humedad vespertina (Humidity3pm), el cual muestra una distribución bimodal o aplanada debido a la transición climática.</w:t>
-      </w:r>
+        <w:t xml:space="preserve">Nota. </w:t>
+      </w:r>
+      <w:r>
+        <w:t>El mapa de calor evidencia que la asociación lineal más relevante para el target binario ocurre con la humedad de la tarde (Humidity3pm, r = 0.45)</w:t>
+      </w:r>
+      <w:r>
+        <w:t xml:space="preserve"> F</w:t>
+      </w:r>
+      <w:r>
+        <w:t>undamentando su selección para la fase inferencial. Adaptado de Rain in Australia, por J. Young, 2018 (https://www.kaggle.com/datasets/jsphgfr/rain-in-australia). Diseñado computacionalmente por el Grupo 6</w:t>
+      </w:r>
+    </w:p>
+    <w:p>
+      <w:pPr>
+        <w:pStyle w:val="Ttulo2"/>
+        <w:numPr>
+          <w:ilvl w:val="0"/>
+          <w:numId w:val="2"/>
+        </w:numPr>
+      </w:pPr>
+      <w:bookmarkStart w:id="3" w:name="_Toc233745580"/>
+      <w:r>
+        <w:lastRenderedPageBreak/>
+        <w:t>Estimación Puntual e Intervalos de Confianza</w:t>
+      </w:r>
+      <w:bookmarkEnd w:id="3"/>
     </w:p>
     <w:p>
       <w:pPr>
@@ -2216,134 +2231,64 @@
     <w:p>
       <w:pPr>
         <w:ind w:firstLine="698"/>
-        <w:jc w:val="left"/>
+      </w:pPr>
+      <w:r>
+        <w:t xml:space="preserve">Como se constata en la Tabla 2, los intervalos de confianza construidos bajo ambos umbrales de certeza (95% y 99%) exhiben una amplitud extraordinariamente estrecha. Este fenómeno es una consecuencia matemática directa del tamaño muestral masivo del estudio (n &gt; 140,000), el cual reduce el error estándar asintóticamente hacia cero. </w:t>
+      </w:r>
+    </w:p>
+    <w:p>
+      <w:pPr>
+        <w:ind w:firstLine="698"/>
+      </w:pPr>
+    </w:p>
+    <w:p>
+      <w:pPr>
+        <w:ind w:firstLine="698"/>
+      </w:pPr>
+      <w:r>
+        <w:t>En términos físicos, existe un 99% de confianza estadística de que la verdadera media poblacional de la humedad vespertina se sitúe entre 46.36% y 46.66% en días secos, y entre 68.52% y 69.08% en vísperas de lluvia. Al elevar la certeza del 95% al 99%, el intervalo se expande de manera marginal en los extremos para mitigar el riesgo de error de muestreo, manteniendo una precisión analítica óptima para la toma de decisiones bajo incertidumbre climática..</w:t>
+      </w:r>
+    </w:p>
+    <w:p>
+      <w:pPr>
+        <w:ind w:firstLine="698"/>
+      </w:pPr>
+    </w:p>
+    <w:p>
+      <w:pPr>
+        <w:ind w:firstLine="698"/>
       </w:pPr>
       <w:r>
         <w:rPr>
           <w:b/>
           <w:bCs/>
         </w:rPr>
-        <w:t xml:space="preserve">Nota: </w:t>
-      </w:r>
-      <w:r>
-        <w:t>La Figura 2 expone la morfología estructural de los dos principales predictores físicos. La presión atmosférica vespertina sigue un comportamiento marcadamente simétrico y acampanado. Por su parte, la humedad relativa a las 3:00 p.m. revela un comportamiento plano y extendido, con una acumulación de frecuencias en los extremos altos, patrón característico de los frentes previos a la inestabilidad pluvial.</w:t>
+        <w:t xml:space="preserve">Tabla 2 </w:t>
+      </w:r>
+      <w:r>
+        <w:t>Estimación Puntual e Intervalos de Confianza Paramétricos al 95% y 99% para Humidity3pm.</w:t>
       </w:r>
     </w:p>
     <w:p>
       <w:pPr>
         <w:ind w:firstLine="698"/>
         <w:jc w:val="left"/>
-        <w:rPr>
-          <w:b/>
-          <w:bCs/>
-        </w:rPr>
-      </w:pPr>
-      <w:r>
-        <w:rPr>
-          <w:b/>
-          <w:bCs/>
-        </w:rPr>
-        <w:t>Fuente:</w:t>
-      </w:r>
-      <w:r>
-        <w:t xml:space="preserve"> Adaptado de </w:t>
-      </w:r>
-      <w:r>
-        <w:rPr>
-          <w:i/>
-          <w:iCs/>
-        </w:rPr>
-        <w:t>Rain in Australia</w:t>
-      </w:r>
-      <w:r>
-        <w:t>, por J. Young, 2018 (</w:t>
-      </w:r>
-      <w:hyperlink r:id="rId17" w:tgtFrame="_blank" w:history="1">
-        <w:r>
-          <w:rPr>
-            <w:rStyle w:val="Hipervnculo"/>
-          </w:rPr>
-          <w:t>https://www.kaggle.com/datasets/jsphgfr/rain-in-australia</w:t>
-        </w:r>
-      </w:hyperlink>
-      <w:r>
-        <w:t>). Diseñado computacionalmente por el Grupo 6.</w:t>
-      </w:r>
+      </w:pPr>
     </w:p>
     <w:p>
       <w:pPr>
         <w:ind w:firstLine="698"/>
         <w:jc w:val="left"/>
-        <w:rPr>
-          <w:i/>
-          <w:iCs/>
-        </w:rPr>
-      </w:pPr>
-      <w:r>
-        <w:rPr>
-          <w:b/>
-          <w:bCs/>
-        </w:rPr>
-        <w:t>Figura 3:</w:t>
-      </w:r>
-      <w:r>
-        <w:t xml:space="preserve"> </w:t>
-      </w:r>
-      <w:r>
-        <w:rPr>
-          <w:i/>
-          <w:iCs/>
-        </w:rPr>
-        <w:t xml:space="preserve">Matriz de coeficientes de correlación de Pearson para las variables meteorológicas del </w:t>
-      </w:r>
-      <w:proofErr w:type="spellStart"/>
-      <w:r>
-        <w:rPr>
-          <w:i/>
-          <w:iCs/>
-        </w:rPr>
-        <w:t>dataset</w:t>
-      </w:r>
-      <w:proofErr w:type="spellEnd"/>
-      <w:r>
-        <w:rPr>
-          <w:i/>
-          <w:iCs/>
-        </w:rPr>
-        <w:t>.</w:t>
-      </w:r>
-    </w:p>
-    <w:p>
-      <w:pPr>
-        <w:ind w:firstLine="698"/>
-        <w:jc w:val="left"/>
-        <w:rPr>
-          <w:i/>
-          <w:iCs/>
-        </w:rPr>
-      </w:pPr>
-      <w:r>
+      </w:pPr>
+      <w:r>
+        <w:rPr>
+          <w:noProof/>
+        </w:rPr>
         <w:drawing>
-          <wp:anchor distT="0" distB="0" distL="114300" distR="114300" simplePos="0" relativeHeight="251666944" behindDoc="1" locked="0" layoutInCell="1" allowOverlap="1" wp14:anchorId="0204ADFB" wp14:editId="1C3F25B8">
-            <wp:simplePos x="0" y="0"/>
-            <wp:positionH relativeFrom="margin">
-              <wp:posOffset>814045</wp:posOffset>
-            </wp:positionH>
-            <wp:positionV relativeFrom="paragraph">
-              <wp:posOffset>52451</wp:posOffset>
-            </wp:positionV>
-            <wp:extent cx="3241675" cy="2515870"/>
-            <wp:effectExtent l="0" t="0" r="0" b="0"/>
-            <wp:wrapTight wrapText="bothSides">
-              <wp:wrapPolygon edited="0">
-                <wp:start x="0" y="0"/>
-                <wp:lineTo x="0" y="21426"/>
-                <wp:lineTo x="21452" y="21426"/>
-                <wp:lineTo x="21452" y="0"/>
-                <wp:lineTo x="0" y="0"/>
-              </wp:wrapPolygon>
-            </wp:wrapTight>
-            <wp:docPr id="559558258" name="Imagen 1"/>
+          <wp:inline distT="0" distB="0" distL="0" distR="0" wp14:anchorId="13232FEC" wp14:editId="2CD953A0">
+            <wp:extent cx="5612130" cy="1102995"/>
+            <wp:effectExtent l="0" t="0" r="7620" b="1905"/>
+            <wp:docPr id="349222421" name="Imagen 1"/>
             <wp:cNvGraphicFramePr>
               <a:graphicFrameLocks xmlns:a="http://schemas.openxmlformats.org/drawingml/2006/main" noChangeAspect="1"/>
             </wp:cNvGraphicFramePr>
@@ -2351,17 +2296,11 @@
               <a:graphicData uri="http://schemas.openxmlformats.org/drawingml/2006/picture">
                 <pic:pic xmlns:pic="http://schemas.openxmlformats.org/drawingml/2006/picture">
                   <pic:nvPicPr>
-                    <pic:cNvPr id="559558258" name=""/>
+                    <pic:cNvPr id="349222421" name=""/>
                     <pic:cNvPicPr/>
                   </pic:nvPicPr>
                   <pic:blipFill>
-                    <a:blip r:embed="rId18">
-                      <a:extLst>
-                        <a:ext uri="{28A0092B-C50C-407E-A947-70E740481C1C}">
-                          <a14:useLocalDpi xmlns:a14="http://schemas.microsoft.com/office/drawing/2010/main" val="0"/>
-                        </a:ext>
-                      </a:extLst>
-                    </a:blip>
+                    <a:blip r:embed="rId18"/>
                     <a:stretch>
                       <a:fillRect/>
                     </a:stretch>
@@ -2369,7 +2308,7 @@
                   <pic:spPr>
                     <a:xfrm>
                       <a:off x="0" y="0"/>
-                      <a:ext cx="3241675" cy="2515870"/>
+                      <a:ext cx="5612130" cy="1102995"/>
                     </a:xfrm>
                     <a:prstGeom prst="rect">
                       <a:avLst/>
@@ -2378,13 +2317,7 @@
                 </pic:pic>
               </a:graphicData>
             </a:graphic>
-            <wp14:sizeRelH relativeFrom="margin">
-              <wp14:pctWidth>0</wp14:pctWidth>
-            </wp14:sizeRelH>
-            <wp14:sizeRelV relativeFrom="margin">
-              <wp14:pctHeight>0</wp14:pctHeight>
-            </wp14:sizeRelV>
-          </wp:anchor>
+          </wp:inline>
         </w:drawing>
       </w:r>
     </w:p>
@@ -2392,165 +2325,29 @@
       <w:pPr>
         <w:ind w:firstLine="698"/>
         <w:jc w:val="left"/>
-        <w:rPr>
-          <w:i/>
-          <w:iCs/>
-        </w:rPr>
-      </w:pPr>
-    </w:p>
-    <w:p>
-      <w:pPr>
-        <w:ind w:firstLine="698"/>
-        <w:jc w:val="left"/>
-        <w:rPr>
-          <w:i/>
-          <w:iCs/>
-        </w:rPr>
-      </w:pPr>
-    </w:p>
-    <w:p>
-      <w:pPr>
-        <w:ind w:firstLine="698"/>
-        <w:jc w:val="left"/>
-        <w:rPr>
-          <w:i/>
-          <w:iCs/>
-        </w:rPr>
-      </w:pPr>
-    </w:p>
-    <w:p>
-      <w:pPr>
-        <w:ind w:firstLine="698"/>
-        <w:jc w:val="left"/>
-        <w:rPr>
-          <w:i/>
-          <w:iCs/>
-        </w:rPr>
-      </w:pPr>
-    </w:p>
-    <w:p>
-      <w:pPr>
-        <w:spacing w:after="160" w:line="278" w:lineRule="auto"/>
-        <w:ind w:left="0" w:firstLine="0"/>
-        <w:jc w:val="left"/>
-      </w:pPr>
-    </w:p>
-    <w:p>
-      <w:pPr>
-        <w:spacing w:after="160" w:line="278" w:lineRule="auto"/>
-        <w:ind w:left="0" w:firstLine="0"/>
-        <w:jc w:val="left"/>
-      </w:pPr>
-    </w:p>
-    <w:p>
-      <w:pPr>
-        <w:spacing w:after="160" w:line="278" w:lineRule="auto"/>
-        <w:ind w:left="0" w:firstLine="0"/>
-        <w:jc w:val="left"/>
-      </w:pPr>
-    </w:p>
-    <w:p>
-      <w:pPr>
-        <w:spacing w:after="160" w:line="278" w:lineRule="auto"/>
-        <w:ind w:left="0" w:firstLine="0"/>
-        <w:jc w:val="left"/>
-      </w:pPr>
-    </w:p>
-    <w:p>
-      <w:pPr>
-        <w:spacing w:after="160" w:line="278" w:lineRule="auto"/>
-        <w:ind w:left="0" w:firstLine="0"/>
-        <w:jc w:val="left"/>
-      </w:pPr>
-    </w:p>
-    <w:p>
-      <w:pPr>
-        <w:spacing w:after="160" w:line="278" w:lineRule="auto"/>
-        <w:ind w:left="0" w:firstLine="0"/>
-        <w:jc w:val="left"/>
-      </w:pPr>
-    </w:p>
-    <w:p>
-      <w:pPr>
-        <w:spacing w:after="160" w:line="278" w:lineRule="auto"/>
-        <w:ind w:left="0" w:firstLine="0"/>
-        <w:jc w:val="left"/>
-      </w:pPr>
-      <w:r>
+      </w:pPr>
+    </w:p>
+    <w:p>
+      <w:pPr>
         <w:rPr>
           <w:b/>
           <w:bCs/>
-          <w:i/>
-          <w:iCs/>
-          <w:sz w:val="18"/>
-          <w:szCs w:val="20"/>
-        </w:rPr>
-        <w:t>Nota.</w:t>
-      </w:r>
-      <w:r>
-        <w:rPr>
-          <w:sz w:val="18"/>
-          <w:szCs w:val="20"/>
-        </w:rPr>
-        <w:t xml:space="preserve"> Adaptado de </w:t>
-      </w:r>
-      <w:r>
-        <w:rPr>
-          <w:i/>
-          <w:iCs/>
-          <w:sz w:val="18"/>
-          <w:szCs w:val="20"/>
-        </w:rPr>
-        <w:t>Rain in Australia</w:t>
-      </w:r>
-      <w:r>
-        <w:rPr>
-          <w:sz w:val="18"/>
-          <w:szCs w:val="20"/>
-        </w:rPr>
-        <w:t>, por J. Young, 2018 (</w:t>
-      </w:r>
-      <w:hyperlink r:id="rId19" w:tgtFrame="_blank" w:history="1">
-        <w:r>
-          <w:rPr>
-            <w:rStyle w:val="Hipervnculo"/>
-            <w:sz w:val="18"/>
-            <w:szCs w:val="20"/>
-          </w:rPr>
-          <w:t>https://www.kaggle.com/datasets/jsphgfr/rain-in-australia</w:t>
-        </w:r>
-      </w:hyperlink>
-      <w:r>
-        <w:rPr>
-          <w:sz w:val="18"/>
-          <w:szCs w:val="20"/>
-        </w:rPr>
-        <w:t xml:space="preserve">). </w:t>
-      </w:r>
+        </w:rPr>
+      </w:pPr>
       <w:r>
         <w:rPr>
           <w:b/>
           <w:bCs/>
-          <w:sz w:val="18"/>
-          <w:szCs w:val="20"/>
-        </w:rPr>
-        <w:t xml:space="preserve">Fuente: </w:t>
-      </w:r>
-      <w:r>
-        <w:rPr>
-          <w:sz w:val="18"/>
-          <w:szCs w:val="20"/>
-        </w:rPr>
-        <w:t>Diseñado computacionalmente por el Grupo 6.</w:t>
-      </w:r>
-      <w:r>
-        <w:br w:type="page"/>
-      </w:r>
-    </w:p>
-    <w:p>
-      <w:pPr>
-        <w:ind w:firstLine="698"/>
-        <w:jc w:val="left"/>
+        </w:rPr>
+        <w:t xml:space="preserve">Nota. </w:t>
+      </w:r>
+      <w:r>
+        <w:t>Estimaciones basadas en el procesamiento inferencial asintótico del dataset (n &gt; 140,000), donde EE = 0.056 para "No" y EE = 0.108 para "Yes". Adaptado de Rain in Australia, por J. Young, 2018. Diseñado computacionalmente por el Grupo 6.</w:t>
+      </w:r>
+    </w:p>
+    <w:p>
+      <w:pPr>
+        <w:pStyle w:val="Ttulo2"/>
       </w:pPr>
     </w:p>
     <w:p>
@@ -2561,365 +2358,20 @@
           <w:numId w:val="2"/>
         </w:numPr>
       </w:pPr>
-      <w:bookmarkStart w:id="3" w:name="_Toc233565145"/>
-      <w:r>
-        <w:t>Estimación Puntual e Intervalos de Confianza</w:t>
-      </w:r>
-      <w:bookmarkEnd w:id="3"/>
-    </w:p>
-    <w:p>
-      <w:pPr>
-        <w:ind w:firstLine="698"/>
-        <w:jc w:val="left"/>
-      </w:pPr>
-      <w:r>
-        <w:t xml:space="preserve">Para determinar los parámetros poblacionales determinantes en la estabilidad barométrica y psicrométrica, se estimaron tres indicadores </w:t>
-      </w:r>
-      <w:proofErr w:type="spellStart"/>
-      <w:r>
-        <w:t>macroclimatológicos</w:t>
-      </w:r>
-      <w:proofErr w:type="spellEnd"/>
-      <w:r>
-        <w:t xml:space="preserve"> utilizando un nivel de confianza del 95%. Amparados en el Teorema Central del Límite (</w:t>
-      </w:r>
-      <w:r>
-        <w:rPr>
-          <w:i/>
-          <w:iCs/>
-        </w:rPr>
-        <w:t>TCL</w:t>
-      </w:r>
-      <w:r>
-        <w:t>), el volumen de observaciones permite asumir distribuciones muestrales asintóticamente normales para las medias continuas y la proporción del fenómeno pluvial. La Tabla 2 resume los intervalos calculados.</w:t>
-      </w:r>
-    </w:p>
-    <w:p>
-      <w:pPr>
-        <w:ind w:firstLine="698"/>
-        <w:jc w:val="left"/>
-      </w:pPr>
-    </w:p>
-    <w:p>
-      <w:pPr>
-        <w:ind w:firstLine="698"/>
-        <w:jc w:val="left"/>
-      </w:pPr>
-      <w:r>
-        <w:rPr>
-          <w:noProof/>
-        </w:rPr>
-        <w:drawing>
-          <wp:anchor distT="0" distB="0" distL="114300" distR="114300" simplePos="0" relativeHeight="251657728" behindDoc="0" locked="0" layoutInCell="1" allowOverlap="1" wp14:anchorId="491EED00" wp14:editId="56EE2A97">
-            <wp:simplePos x="0" y="0"/>
-            <wp:positionH relativeFrom="margin">
-              <wp:align>left</wp:align>
-            </wp:positionH>
-            <wp:positionV relativeFrom="margin">
-              <wp:posOffset>2015033</wp:posOffset>
-            </wp:positionV>
-            <wp:extent cx="5612130" cy="1108710"/>
-            <wp:effectExtent l="0" t="0" r="7620" b="0"/>
-            <wp:wrapSquare wrapText="bothSides"/>
-            <wp:docPr id="1864562310" name="Imagen 1"/>
-            <wp:cNvGraphicFramePr>
-              <a:graphicFrameLocks xmlns:a="http://schemas.openxmlformats.org/drawingml/2006/main" noChangeAspect="1"/>
-            </wp:cNvGraphicFramePr>
-            <a:graphic xmlns:a="http://schemas.openxmlformats.org/drawingml/2006/main">
-              <a:graphicData uri="http://schemas.openxmlformats.org/drawingml/2006/picture">
-                <pic:pic xmlns:pic="http://schemas.openxmlformats.org/drawingml/2006/picture">
-                  <pic:nvPicPr>
-                    <pic:cNvPr id="1864562310" name=""/>
-                    <pic:cNvPicPr/>
-                  </pic:nvPicPr>
-                  <pic:blipFill>
-                    <a:blip r:embed="rId20">
-                      <a:extLst>
-                        <a:ext uri="{28A0092B-C50C-407E-A947-70E740481C1C}">
-                          <a14:useLocalDpi xmlns:a14="http://schemas.microsoft.com/office/drawing/2010/main" val="0"/>
-                        </a:ext>
-                      </a:extLst>
-                    </a:blip>
-                    <a:stretch>
-                      <a:fillRect/>
-                    </a:stretch>
-                  </pic:blipFill>
-                  <pic:spPr>
-                    <a:xfrm>
-                      <a:off x="0" y="0"/>
-                      <a:ext cx="5612130" cy="1108710"/>
-                    </a:xfrm>
-                    <a:prstGeom prst="rect">
-                      <a:avLst/>
-                    </a:prstGeom>
-                  </pic:spPr>
-                </pic:pic>
-              </a:graphicData>
-            </a:graphic>
-          </wp:anchor>
-        </w:drawing>
-      </w:r>
-      <w:r>
-        <w:rPr>
-          <w:b/>
-          <w:bCs/>
-        </w:rPr>
-        <w:t>Tabla 2</w:t>
-      </w:r>
-      <w:r>
-        <w:t xml:space="preserve"> </w:t>
-      </w:r>
-      <w:r>
-        <w:rPr>
-          <w:i/>
-          <w:iCs/>
-        </w:rPr>
-        <w:t>Estimación Puntual e Intervalos de Confianza Paramétricos al 95% y 99%</w:t>
-      </w:r>
-    </w:p>
-    <w:p>
-      <w:pPr>
-        <w:ind w:firstLine="698"/>
-        <w:jc w:val="left"/>
-      </w:pPr>
-      <w:r>
-        <w:rPr>
-          <w:b/>
-          <w:bCs/>
-          <w:i/>
-          <w:iCs/>
-        </w:rPr>
-        <w:t>Nota</w:t>
-      </w:r>
-      <w:r>
-        <w:rPr>
-          <w:i/>
-          <w:iCs/>
-        </w:rPr>
+      <w:bookmarkStart w:id="4" w:name="_Toc233745581"/>
+      <w:r>
+        <w:t>Aplicación de Pruebas de Hipótesis</w:t>
+      </w:r>
+      <w:r>
         <w:t>.</w:t>
       </w:r>
-      <w:r>
-        <w:t xml:space="preserve"> Estimaciones basadas en el procesamiento inferencial asintótico del </w:t>
-      </w:r>
-      <w:proofErr w:type="spellStart"/>
-      <w:r>
-        <w:t>dataset</w:t>
-      </w:r>
-      <w:proofErr w:type="spellEnd"/>
-      <w:r>
-        <w:t xml:space="preserve"> </w:t>
-      </w:r>
-      <w:r>
-        <w:rPr>
-          <w:i/>
-          <w:iCs/>
-        </w:rPr>
-        <w:t>Rain in Australia</w:t>
-      </w:r>
-      <w:r>
-        <w:t xml:space="preserve"> (</w:t>
-      </w:r>
-      <w:r>
-        <w:rPr>
-          <w:i/>
-          <w:iCs/>
-        </w:rPr>
-        <w:t>n &gt; 140,000</w:t>
-      </w:r>
-      <w:r>
-        <w:t xml:space="preserve">). </w:t>
-      </w:r>
-    </w:p>
-    <w:p>
-      <w:pPr>
-        <w:ind w:firstLine="698"/>
-        <w:jc w:val="left"/>
-      </w:pPr>
-      <w:r>
-        <w:rPr>
-          <w:b/>
-          <w:bCs/>
-          <w:i/>
-          <w:iCs/>
-        </w:rPr>
-        <w:t xml:space="preserve">Fuente: </w:t>
-      </w:r>
-      <w:r>
-        <w:t>Cálculos computacionales desarrollados por el Grupo 6.</w:t>
-      </w:r>
-    </w:p>
-    <w:p>
-      <w:pPr>
-        <w:ind w:firstLine="698"/>
-        <w:jc w:val="left"/>
-      </w:pPr>
-    </w:p>
-    <w:p>
-      <w:pPr>
-        <w:ind w:firstLine="698"/>
-        <w:jc w:val="left"/>
-      </w:pPr>
-      <w:r>
-        <w:t>Como se constata en la Tabla 2, los intervalos de confianza construidos bajo ambos umbrales de certeza (</w:t>
-      </w:r>
-      <w:r>
-        <w:rPr>
-          <w:i/>
-          <w:iCs/>
-        </w:rPr>
-        <w:t>1</w:t>
-      </w:r>
-      <w:r>
-        <w:rPr>
-          <w:i/>
-          <w:iCs/>
-        </w:rPr>
-        <w:t xml:space="preserve"> </w:t>
-      </w:r>
-      <w:r>
-        <w:rPr>
-          <w:i/>
-          <w:iCs/>
-        </w:rPr>
-        <w:t>-</w:t>
-      </w:r>
-      <w:r>
-        <w:rPr>
-          <w:i/>
-          <w:iCs/>
-        </w:rPr>
-        <w:t xml:space="preserve"> </w:t>
-      </w:r>
-      <w:r>
-        <w:rPr>
-          <w:i/>
-          <w:iCs/>
-        </w:rPr>
-        <w:t xml:space="preserve">α = </w:t>
-      </w:r>
-      <w:r>
-        <w:rPr>
-          <w:i/>
-          <w:iCs/>
-        </w:rPr>
-        <w:t>0</w:t>
-      </w:r>
-      <w:r>
-        <w:rPr>
-          <w:i/>
-          <w:iCs/>
-        </w:rPr>
-        <w:t>.95</w:t>
-      </w:r>
-      <w:r>
-        <w:t xml:space="preserve"> y </w:t>
-      </w:r>
-      <w:r>
-        <w:rPr>
-          <w:i/>
-          <w:iCs/>
-        </w:rPr>
-        <w:t>1-</w:t>
-      </w:r>
-      <w:r>
-        <w:rPr>
-          <w:i/>
-          <w:iCs/>
-        </w:rPr>
-        <w:t xml:space="preserve"> </w:t>
-      </w:r>
-      <w:r>
-        <w:rPr>
-          <w:i/>
-          <w:iCs/>
-        </w:rPr>
-        <w:t xml:space="preserve">α = </w:t>
-      </w:r>
-      <w:r>
-        <w:rPr>
-          <w:i/>
-          <w:iCs/>
-        </w:rPr>
-        <w:t>0</w:t>
-      </w:r>
-      <w:r>
-        <w:rPr>
-          <w:i/>
-          <w:iCs/>
-        </w:rPr>
-        <w:t>.99</w:t>
-      </w:r>
-      <w:r>
-        <w:t>) exhiben una amplitud extraordinariamente estrecha. Este fenómeno es una consecuencia matemática directa del tamaño muestral masivo del estudio (</w:t>
-      </w:r>
-      <w:r>
-        <w:rPr>
-          <w:i/>
-          <w:iCs/>
-        </w:rPr>
-        <w:t>n &gt; 140,000</w:t>
-      </w:r>
-      <w:r>
-        <w:t>), el cual reduce el error estándar de las distribuciones de medias asintóticamente hacia cero.</w:t>
-      </w:r>
-    </w:p>
-    <w:p>
-      <w:pPr>
-        <w:ind w:firstLine="698"/>
-        <w:jc w:val="left"/>
-      </w:pPr>
-      <w:r>
-        <w:t>En términos físicos, podemos afirmar con un 99% de confianza estadística que la media poblacional de la humedad vespertina (</w:t>
-      </w:r>
-      <w:r>
-        <w:rPr>
-          <w:i/>
-          <w:iCs/>
-        </w:rPr>
-        <w:t>Humidity3pm</w:t>
-      </w:r>
-      <w:r>
-        <w:t xml:space="preserve">) se encuentra contenida de forma estricta entre el </w:t>
-      </w:r>
-      <w:r>
-        <w:rPr>
-          <w:i/>
-          <w:iCs/>
-        </w:rPr>
-        <w:t>51.34%</w:t>
-      </w:r>
-      <w:r>
-        <w:t xml:space="preserve"> y el </w:t>
-      </w:r>
-      <w:r>
-        <w:rPr>
-          <w:i/>
-          <w:iCs/>
-        </w:rPr>
-        <w:t>51.62%</w:t>
-      </w:r>
-      <w:r>
-        <w:t>. Al elevar la certeza al 99%, el intervalo se expande de manera marginal en los extremos para mitigar el riesgo de error, manteniendo una precisión analítica óptima para la toma de decisiones bajo incertidumbre climática.</w:t>
-      </w:r>
-    </w:p>
-    <w:p>
-      <w:pPr>
-        <w:pStyle w:val="Ttulo2"/>
-      </w:pPr>
-      <w:bookmarkStart w:id="4" w:name="_Toc233565146"/>
-      <w:r>
-        <w:t>4. Aplicación de Pruebas de Hipótesis</w:t>
-      </w:r>
-      <w:r>
-        <w:t>.</w:t>
-      </w:r>
       <w:bookmarkEnd w:id="4"/>
     </w:p>
     <w:p>
       <w:pPr>
         <w:pStyle w:val="Ttulo3"/>
       </w:pPr>
-      <w:bookmarkStart w:id="5" w:name="_Toc233565147"/>
+      <w:bookmarkStart w:id="5" w:name="_Toc233745582"/>
       <w:r>
         <w:t>4.1. Contraste de Medias Paramétrico: Humedad vs. Inestabilidad Pluvial</w:t>
       </w:r>
@@ -2928,185 +2380,10 @@
     <w:p>
       <w:pPr>
         <w:ind w:firstLine="698"/>
-        <w:jc w:val="left"/>
-      </w:pPr>
-      <w:r>
-        <w:t xml:space="preserve">Para evaluar si las condiciones de saturación de agua difieren significativamente en la víspera de una tormenta, se contrastaron las medias de la variable cuantitativa continua </w:t>
-      </w:r>
-      <w:r>
-        <w:rPr>
-          <w:i/>
-          <w:iCs/>
-        </w:rPr>
-        <w:t>Humidity3pm</w:t>
-      </w:r>
-      <w:r>
-        <w:t xml:space="preserve"> segmentada según el desenlace de la variable </w:t>
-      </w:r>
-      <w:proofErr w:type="gramStart"/>
-      <w:r>
-        <w:t>objetivo binaria</w:t>
-      </w:r>
-      <w:proofErr w:type="gramEnd"/>
-      <w:r>
-        <w:t xml:space="preserve"> </w:t>
-      </w:r>
-      <w:proofErr w:type="spellStart"/>
-      <w:r>
-        <w:rPr>
-          <w:i/>
-          <w:iCs/>
-        </w:rPr>
-        <w:t>RainTomorrow</w:t>
-      </w:r>
-      <w:proofErr w:type="spellEnd"/>
-      <w:r>
-        <w:t xml:space="preserve"> (Grupos: Yes vs. No).</w:t>
-      </w:r>
-    </w:p>
-    <w:p>
-      <w:pPr>
-        <w:ind w:firstLine="698"/>
-        <w:jc w:val="left"/>
-      </w:pPr>
-      <w:r>
-        <w:t>Dado que ambas submuestras presentan varianzas y tamaños disímiles (</w:t>
-      </w:r>
-      <m:oMath>
-        <m:sSub>
-          <m:sSubPr>
-            <m:ctrlPr>
-              <w:rPr>
-                <w:rFonts w:ascii="Cambria Math" w:hAnsi="Cambria Math"/>
-              </w:rPr>
-            </m:ctrlPr>
-          </m:sSubPr>
-          <m:e>
-            <m:r>
-              <w:rPr>
-                <w:rFonts w:ascii="Cambria Math" w:hAnsi="Cambria Math"/>
-              </w:rPr>
-              <m:t>n</m:t>
-            </m:r>
-          </m:e>
-          <m:sub>
-            <m:r>
-              <m:rPr>
-                <m:nor/>
-              </m:rPr>
-              <m:t>No</m:t>
-            </m:r>
-          </m:sub>
-        </m:sSub>
-        <m:r>
-          <w:rPr>
-            <w:rFonts w:ascii="Cambria Math" w:hAnsi="Cambria Math"/>
-          </w:rPr>
-          <m:t>=110,</m:t>
-        </m:r>
-      </m:oMath>
-      <w:proofErr w:type="gramStart"/>
-      <w:r>
-        <w:rPr>
-          <w:i/>
-          <w:iCs/>
-        </w:rPr>
-        <w:t>316</w:t>
-      </w:r>
-      <w:r>
-        <w:t xml:space="preserve">; </w:t>
-      </w:r>
-      <w:r>
-        <w:t xml:space="preserve">  </w:t>
-      </w:r>
-      <w:proofErr w:type="gramEnd"/>
-      <w:r>
-        <w:t xml:space="preserve"> </w:t>
-      </w:r>
-      <m:oMath>
-        <m:sSub>
-          <m:sSubPr>
-            <m:ctrlPr>
-              <w:rPr>
-                <w:rFonts w:ascii="Cambria Math" w:hAnsi="Cambria Math"/>
-              </w:rPr>
-            </m:ctrlPr>
-          </m:sSubPr>
-          <m:e>
-            <m:r>
-              <w:rPr>
-                <w:rFonts w:ascii="Cambria Math" w:hAnsi="Cambria Math"/>
-              </w:rPr>
-              <m:t>n</m:t>
-            </m:r>
-          </m:e>
-          <m:sub>
-            <m:r>
-              <m:rPr>
-                <m:nor/>
-              </m:rPr>
-              <m:t>Yes</m:t>
-            </m:r>
-          </m:sub>
-        </m:sSub>
-        <m:r>
-          <w:rPr>
-            <w:rFonts w:ascii="Cambria Math" w:hAnsi="Cambria Math"/>
-          </w:rPr>
-          <m:t>=31,877</m:t>
-        </m:r>
-      </m:oMath>
-      <w:r>
-        <w:t xml:space="preserve">), se seleccionó la </w:t>
-      </w:r>
-      <w:r>
-        <w:rPr>
-          <w:b/>
-          <w:bCs/>
-        </w:rPr>
-        <w:t xml:space="preserve">Prueba </w:t>
-      </w:r>
-      <w:r>
-        <w:rPr>
-          <w:b/>
-          <w:bCs/>
-          <w:i/>
-          <w:iCs/>
-        </w:rPr>
-        <w:t>t</w:t>
-      </w:r>
-      <w:r>
-        <w:rPr>
-          <w:b/>
-          <w:bCs/>
-        </w:rPr>
-        <w:t xml:space="preserve"> de Welch</w:t>
-      </w:r>
-      <w:r>
-        <w:t xml:space="preserve">, la cual no asume homogeneidad de varianzas. Fijando un nivel de significancia de </w:t>
-      </w:r>
-      <w:r>
-        <w:rPr>
-          <w:i/>
-          <w:iCs/>
-        </w:rPr>
-        <w:t>α = 0.05</w:t>
-      </w:r>
-      <w:r>
-        <w:t>, se formuló el siguiente contraste:</w:t>
-      </w:r>
-    </w:p>
-    <w:p>
-      <w:pPr>
-        <w:ind w:firstLine="698"/>
-        <w:jc w:val="left"/>
-      </w:pPr>
-    </w:p>
-    <w:p>
-      <w:pPr>
-        <w:ind w:firstLine="698"/>
-        <w:jc w:val="left"/>
-      </w:pPr>
+      </w:pPr>
+      <w:r>
+        <w:t>Para evaluar si las condiciones de saturación de agua difieren significativamente en la víspera de una tormenta, se contrastaron las medias de la variable cuantitativa continua Humidity3pm según el desenlace de la variable objetivo binaria RainTomorrow (Yes vs. No). Dado que ambas submuestras presentan varianzas y tamaños disímiles (n_No = 107,670; n_Yes = 30,913), se seleccionó la Prueba t de Welch, la cual no asume homogeneidad de varianzas. Fijando un nivel de significancia de α = 0.05, se formuló el siguiente contraste unilateral derecho:</w:t>
+      </w:r>
     </w:p>
     <w:p>
       <w:pPr>
@@ -3208,22 +2485,26 @@
               </m:r>
             </m:sub>
           </m:sSub>
-        </m:oMath>
-      </m:oMathPara>
-    </w:p>
-    <w:p>
-      <w:pPr>
-        <w:ind w:firstLine="698"/>
-        <w:jc w:val="left"/>
-      </w:pPr>
-    </w:p>
-    <w:p>
-      <w:pPr>
-        <w:ind w:firstLine="698"/>
-        <w:jc w:val="left"/>
-      </w:pPr>
-      <m:oMathPara>
-        <m:oMath>
+          <m:r>
+            <w:rPr>
+              <w:rFonts w:ascii="Cambria Math" w:hAnsi="Cambria Math"/>
+              <w:i/>
+            </w:rPr>
+            <m:t> </m:t>
+          </m:r>
+          <m:r>
+            <m:rPr>
+              <m:nor/>
+            </m:rPr>
+            <m:t>vs.</m:t>
+          </m:r>
+          <m:r>
+            <w:rPr>
+              <w:rFonts w:ascii="Cambria Math" w:hAnsi="Cambria Math"/>
+              <w:i/>
+            </w:rPr>
+            <m:t> </m:t>
+          </m:r>
           <m:sSub>
             <m:sSubPr>
               <m:ctrlPr>
@@ -3284,7 +2565,7 @@
             <w:rPr>
               <w:rFonts w:ascii="Cambria Math" w:hAnsi="Cambria Math"/>
             </w:rPr>
-            <m:t>≠</m:t>
+            <m:t>&gt;</m:t>
           </m:r>
           <m:sSub>
             <m:sSubPr>
@@ -3311,13 +2592,6 @@
               </m:r>
             </m:sub>
           </m:sSub>
-          <m:r>
-            <w:rPr>
-              <w:sz w:val="32"/>
-              <w:szCs w:val="36"/>
-            </w:rPr>
-            <w:br/>
-          </m:r>
         </m:oMath>
       </m:oMathPara>
     </w:p>
@@ -3330,168 +2604,40 @@
     <w:p>
       <w:pPr>
         <w:ind w:firstLine="698"/>
+      </w:pPr>
+      <w:r>
+        <w:t xml:space="preserve">Las medias muestrales reales calculadas corresponden a un 68.80% de humedad vespertina en el grupo de días previos a lluvia efectiva, frente a un 46.51% en los días que concluyeron secos. La rutina informática arrojó un estadístico t = 182.61 con un valor p &lt; 0.0001 (grados de libertad gl </w:t>
+      </w:r>
+      <w:r>
+        <w:lastRenderedPageBreak/>
+        <w:t>= 48,892.80), provocando el rechazo categórico de la hipótesis nula (H0). El tamaño del efecto evaluado mediante la d de Cohen es de 1.20, un impacto considerado estadísticamente grande y severo. A diferencia de otros entornos de clasificación donde los predictores exhiben alta variabilidad residual, la humedad vespertina actúa aquí como un predictor discriminador tajante y un biomarcador físico directo de la inestabilidad del sistema meteorológico continental.</w:t>
+      </w:r>
+    </w:p>
+    <w:p>
+      <w:pPr>
+        <w:ind w:firstLine="698"/>
         <w:jc w:val="left"/>
       </w:pPr>
-      <w:r>
-        <w:t xml:space="preserve">Las medias muestrales calculadas corresponden a un </w:t>
-      </w:r>
-      <w:r>
-        <w:rPr>
-          <w:i/>
-          <w:iCs/>
-        </w:rPr>
-        <w:t>81.14%</w:t>
-      </w:r>
-      <w:r>
-        <w:t xml:space="preserve"> de humedad vespertina en el grupo de días previos a lluvia efectiva, frente a un </w:t>
-      </w:r>
-      <w:r>
-        <w:rPr>
-          <w:i/>
-          <w:iCs/>
-        </w:rPr>
-        <w:t>42.92%</w:t>
-      </w:r>
-      <w:r>
-        <w:t xml:space="preserve"> en los días que concluyeron secos. La rutina informática arrojó un estadístico </w:t>
-      </w:r>
-      <w:r>
-        <w:rPr>
-          <w:i/>
-          <w:iCs/>
-        </w:rPr>
-        <w:t>t = 241.97</w:t>
-      </w:r>
-      <w:r>
-        <w:t xml:space="preserve"> con un valor </w:t>
-      </w:r>
-      <w:r>
-        <w:rPr>
-          <w:i/>
-          <w:iCs/>
-        </w:rPr>
-        <w:t>p &lt; 0.0001</w:t>
-      </w:r>
-      <w:r>
-        <w:t>, provocando el rechazo categórico de la hipótesis nula (</w:t>
-      </w:r>
-      <w:r>
-        <w:rPr>
-          <w:i/>
-          <w:iCs/>
-        </w:rPr>
-        <w:t>H</w:t>
-      </w:r>
-      <w:r>
-        <w:rPr>
-          <w:i/>
-          <w:iCs/>
-          <w:sz w:val="28"/>
-          <w:szCs w:val="32"/>
-          <w:vertAlign w:val="subscript"/>
-        </w:rPr>
-        <w:t>0</w:t>
-      </w:r>
-      <w:r>
-        <w:t>).</w:t>
-      </w:r>
     </w:p>
     <w:p>
       <w:pPr>
         <w:ind w:firstLine="698"/>
         <w:jc w:val="left"/>
       </w:pPr>
-      <w:r>
-        <w:t xml:space="preserve">El tamaño del efecto evaluado mediante la </w:t>
-      </w:r>
       <w:r>
         <w:rPr>
           <w:b/>
           <w:bCs/>
-          <w:i/>
-          <w:iCs/>
-        </w:rPr>
-        <w:t>d</w:t>
-      </w:r>
-      <w:r>
-        <w:rPr>
-          <w:b/>
-          <w:bCs/>
-        </w:rPr>
-        <w:t xml:space="preserve"> de Cohen</w:t>
-      </w:r>
-      <w:r>
-        <w:t xml:space="preserve"> es de </w:t>
-      </w:r>
-      <w:r>
-        <w:rPr>
-          <w:i/>
-          <w:iCs/>
-        </w:rPr>
-        <w:t>1.21</w:t>
-      </w:r>
-      <w:r>
-        <w:t xml:space="preserve">, un impacto considerado estadísticamente </w:t>
-      </w:r>
-      <w:r>
-        <w:rPr>
-          <w:b/>
-          <w:bCs/>
-        </w:rPr>
-        <w:t>grande y severo</w:t>
-      </w:r>
-      <w:r>
-        <w:t>. A diferencia del modelamiento de variables crediticias, la humedad actúa aquí como un predictor discriminador tajante y un biomarcador físico directo del sistema meteorológico.</w:t>
-      </w:r>
-    </w:p>
-    <w:p>
-      <w:pPr>
-        <w:ind w:firstLine="698"/>
-        <w:jc w:val="left"/>
-      </w:pPr>
-    </w:p>
-    <w:p>
-      <w:pPr>
-        <w:ind w:firstLine="698"/>
-        <w:jc w:val="left"/>
-      </w:pPr>
-      <w:r>
-        <w:rPr>
-          <w:b/>
-          <w:bCs/>
-        </w:rPr>
-        <w:t>Figura 4</w:t>
-      </w:r>
-      <w:r>
-        <w:t xml:space="preserve"> </w:t>
-      </w:r>
-      <w:r>
-        <w:rPr>
-          <w:i/>
-          <w:iCs/>
-        </w:rPr>
-        <w:t>Distribución de la Humedad Relativa a las 3:00 p.m. condicionada por la Ocurrencia Pluvial al Día Siguiente.</w:t>
-      </w:r>
-      <w:r>
-        <w:t xml:space="preserve"> </w:t>
-      </w:r>
-      <w:r>
-        <w:rPr>
-          <w:i/>
-          <w:iCs/>
-        </w:rPr>
-        <w:t>Nota.</w:t>
-      </w:r>
-      <w:r>
-        <w:t xml:space="preserve"> Procesamiento inferencial ejecutado por el Grupo 6.</w:t>
-      </w:r>
-    </w:p>
-    <w:p>
-      <w:pPr>
-        <w:ind w:firstLine="698"/>
-        <w:jc w:val="left"/>
-      </w:pPr>
-      <w:r>
+        </w:rPr>
+        <w:t xml:space="preserve">Figura 4 </w:t>
+      </w:r>
+      <w:r>
+        <w:t>Distribución de Variables Meteorológicas Continuas Condicionadas por la Ocurrencia Pluvial.</w:t>
+      </w:r>
+      <w:r>
+        <w:rPr>
+          <w:noProof/>
+        </w:rPr>
         <w:drawing>
           <wp:inline distT="0" distB="0" distL="0" distR="0" wp14:anchorId="04003A58" wp14:editId="4AEE3278">
             <wp:extent cx="4579315" cy="2747174"/>
@@ -3508,7 +2654,7 @@
                     <pic:cNvPicPr/>
                   </pic:nvPicPr>
                   <pic:blipFill>
-                    <a:blip r:embed="rId21"/>
+                    <a:blip r:embed="rId19"/>
                     <a:stretch>
                       <a:fillRect/>
                     </a:stretch>
@@ -3534,12 +2680,6 @@
         <w:ind w:firstLine="698"/>
         <w:jc w:val="left"/>
         <w:rPr>
-          <w:sz w:val="18"/>
-          <w:szCs w:val="20"/>
-        </w:rPr>
-      </w:pPr>
-      <w:r>
-        <w:rPr>
           <w:b/>
           <w:bCs/>
           <w:i/>
@@ -3547,57 +2687,6 @@
           <w:sz w:val="18"/>
           <w:szCs w:val="20"/>
         </w:rPr>
-        <w:t>Nota.</w:t>
-      </w:r>
-      <w:r>
-        <w:rPr>
-          <w:sz w:val="18"/>
-          <w:szCs w:val="20"/>
-        </w:rPr>
-        <w:t xml:space="preserve"> Adaptado de </w:t>
-      </w:r>
-      <w:r>
-        <w:rPr>
-          <w:i/>
-          <w:iCs/>
-          <w:sz w:val="18"/>
-          <w:szCs w:val="20"/>
-        </w:rPr>
-        <w:t>Rain in Australia</w:t>
-      </w:r>
-      <w:r>
-        <w:rPr>
-          <w:sz w:val="18"/>
-          <w:szCs w:val="20"/>
-        </w:rPr>
-        <w:t>, por J. Young, 2018 (</w:t>
-      </w:r>
-      <w:hyperlink r:id="rId22" w:tgtFrame="_blank" w:history="1">
-        <w:r>
-          <w:rPr>
-            <w:rStyle w:val="Hipervnculo"/>
-            <w:sz w:val="18"/>
-            <w:szCs w:val="20"/>
-          </w:rPr>
-          <w:t>https://www.kaggle.com/datasets/jsphgfr/rain-in-australia</w:t>
-        </w:r>
-      </w:hyperlink>
-      <w:r>
-        <w:rPr>
-          <w:sz w:val="18"/>
-          <w:szCs w:val="20"/>
-        </w:rPr>
-        <w:t xml:space="preserve">). </w:t>
-      </w:r>
-    </w:p>
-    <w:p>
-      <w:pPr>
-        <w:ind w:firstLine="698"/>
-        <w:jc w:val="left"/>
-        <w:rPr>
-          <w:sz w:val="18"/>
-          <w:szCs w:val="20"/>
-        </w:rPr>
       </w:pPr>
       <w:r>
         <w:rPr>
@@ -3608,32 +2697,85 @@
           <w:sz w:val="18"/>
           <w:szCs w:val="20"/>
         </w:rPr>
-        <w:t>Fuente:</w:t>
-      </w:r>
-      <w:r>
-        <w:rPr>
+        <w:t xml:space="preserve">Nota. </w:t>
+      </w:r>
+      <w:r>
+        <w:rPr>
+          <w:i/>
+          <w:iCs/>
           <w:sz w:val="18"/>
           <w:szCs w:val="20"/>
         </w:rPr>
-        <w:t xml:space="preserve"> </w:t>
-      </w:r>
-      <w:r>
-        <w:rPr>
+        <w:t>El panel inferior izquierdo ilustra la separación drástica en los rangos intercuartílicos de Humidity3pm entre ambos grupos, respaldando el comportamiento discriminador analizado en la prueba t de Welch.</w:t>
+      </w:r>
+      <w:r>
+        <w:rPr>
+          <w:b/>
+          <w:bCs/>
+          <w:i/>
+          <w:iCs/>
           <w:sz w:val="18"/>
           <w:szCs w:val="20"/>
         </w:rPr>
-        <w:t>Diseñado computacionalmente por el Grupo 6.</w:t>
-      </w:r>
-    </w:p>
-    <w:p>
-      <w:pPr>
-        <w:pStyle w:val="Ttulo3"/>
+        <w:t xml:space="preserve"> </w:t>
+      </w:r>
+    </w:p>
+    <w:p>
+      <w:pPr>
+        <w:ind w:firstLine="698"/>
+        <w:jc w:val="left"/>
+        <w:rPr>
+          <w:i/>
+          <w:iCs/>
+          <w:sz w:val="18"/>
+          <w:szCs w:val="20"/>
+        </w:rPr>
+      </w:pPr>
+      <w:r>
+        <w:rPr>
+          <w:b/>
+          <w:bCs/>
+          <w:sz w:val="18"/>
+          <w:szCs w:val="20"/>
+        </w:rPr>
+        <w:t>Fuente:</w:t>
+      </w:r>
+      <w:r>
+        <w:rPr>
+          <w:b/>
+          <w:bCs/>
+          <w:i/>
+          <w:iCs/>
+          <w:sz w:val="18"/>
+          <w:szCs w:val="20"/>
+        </w:rPr>
+        <w:t xml:space="preserve"> </w:t>
+      </w:r>
+      <w:r>
+        <w:rPr>
+          <w:i/>
+          <w:iCs/>
+          <w:sz w:val="18"/>
+          <w:szCs w:val="20"/>
+        </w:rPr>
+        <w:t>Adaptado de Rain in Australia, por J. Young, 2018 (https://www.kaggle.com/datasets/jsphgfr/rain-in-australia). Diseñado computacionalmente por el Grupo 6.</w:t>
+      </w:r>
+      <w:bookmarkStart w:id="6" w:name="_Toc233745583"/>
+    </w:p>
+    <w:p>
+      <w:pPr>
+        <w:ind w:firstLine="698"/>
+        <w:jc w:val="left"/>
+      </w:pPr>
+    </w:p>
+    <w:p>
+      <w:pPr>
+        <w:pStyle w:val="Ttulo2"/>
         <w:numPr>
           <w:ilvl w:val="0"/>
           <w:numId w:val="2"/>
         </w:numPr>
       </w:pPr>
-      <w:bookmarkStart w:id="6" w:name="_Toc233565148"/>
       <w:r>
         <w:t>Documentación de Procedimientos y Trazabilidad</w:t>
       </w:r>
@@ -3641,432 +2783,338 @@
     </w:p>
     <w:p>
       <w:pPr>
+        <w:ind w:firstLine="698"/>
+        <w:jc w:val="left"/>
+      </w:pPr>
+    </w:p>
+    <w:p>
+      <w:pPr>
+        <w:ind w:firstLine="698"/>
+      </w:pPr>
+      <w:r>
+        <w:t>Para garantizar la reproducibilidad científica exigida en el programa de Magíster, el Grupo 6 implementó una arquitectura de código estructurada y modular. El cuaderno de trabajo Jupyter Notebook adjunto fue diseñado de manera lineal, permitiendo que cualquier auditor de datos replique la totalidad del flujo metodológico (carga, cálculo y visualización) de forma cronológica y libre de errores de entorno.</w:t>
+      </w:r>
+    </w:p>
+    <w:p>
+      <w:pPr>
+        <w:ind w:firstLine="698"/>
+      </w:pPr>
+    </w:p>
+    <w:p>
+      <w:pPr>
+        <w:ind w:firstLine="698"/>
+      </w:pPr>
+      <w:r>
+        <w:t>Las funciones analíticas críticas empleadas para la inferencia estadística—tales como el cálculo de intervalos de confianza paramétricos mediante la distribución t-Student y la ejecución de la prueba t de Welch para varianzas heterogéneas—fueron encapsuladas de manera externa en el módulo local src/estadistica_utils.py. Esta práctica de ingeniería de software previene la redundancia en el espacio de trabajo principal y asegura la transparencia algorítmica del reporte técnico.</w:t>
+      </w:r>
+    </w:p>
+    <w:p>
+      <w:pPr>
+        <w:spacing w:after="160" w:line="278" w:lineRule="auto"/>
+        <w:ind w:left="0" w:firstLine="0"/>
+        <w:jc w:val="left"/>
+      </w:pPr>
+      <w:r>
+        <w:br w:type="page"/>
+      </w:r>
+    </w:p>
+    <w:p>
+      <w:pPr>
+        <w:ind w:firstLine="698"/>
+      </w:pPr>
+      <w:r>
+        <w:lastRenderedPageBreak/>
+        <w:t>Con el propósito de mitigar riesgos de inconsistencia y asegurar una trazabilidad documental absoluta, el equipo implementó una rutina automatizada de verificación cruzada. Cada estimador estadístico, valor p, intervalo de confianza y coeficiente de asociación reportado en este documento fue validado e indexado de forma directa contra las salidas de las celdas de ejecución del Notebook. Asimismo, las tablas resumen y las ilustraciones gráficas fueron exportadas de manera nativa e inequívoca desde el entorno de desarrollo hacia el repositorio de documentación final, garantizando una correspondencia simétrica del 100% entre el procesamiento informático y el informe técnico ejecutivo.</w:t>
+      </w:r>
+    </w:p>
+    <w:p>
+      <w:pPr>
+        <w:ind w:firstLine="698"/>
+        <w:jc w:val="left"/>
+      </w:pPr>
+    </w:p>
+    <w:p>
+      <w:pPr>
+        <w:pStyle w:val="Ttulo2"/>
+        <w:numPr>
+          <w:ilvl w:val="0"/>
+          <w:numId w:val="2"/>
+        </w:numPr>
+      </w:pPr>
+      <w:bookmarkStart w:id="7" w:name="_Toc233745584"/>
+      <w:r>
+        <w:t>Interpretación Preliminar y Conclusiones para la Toma de Decisiones</w:t>
+      </w:r>
+      <w:r>
+        <w:t>.</w:t>
+      </w:r>
+      <w:bookmarkEnd w:id="7"/>
+      <w:r>
+        <w:t xml:space="preserve"> </w:t>
+      </w:r>
+    </w:p>
+    <w:p>
+      <w:pPr>
+        <w:ind w:left="360" w:firstLine="0"/>
+        <w:jc w:val="left"/>
+      </w:pPr>
+    </w:p>
+    <w:p>
+      <w:pPr>
+        <w:ind w:left="360" w:firstLine="0"/>
+      </w:pPr>
+      <w:r>
+        <w:t>El análisis exploratorio e inferencial desarrollado sobre el registro histórico meteorológico de la Commonwealth de Australia provee conclusiones cuantitativas fundamentales para la mitigación del riesgo operativo y la toma de decisiones estratégicas bajo escenarios de alta incertidumbre:</w:t>
+      </w:r>
+    </w:p>
+    <w:p>
+      <w:pPr>
+        <w:ind w:left="360" w:firstLine="0"/>
+      </w:pPr>
+    </w:p>
+    <w:p>
+      <w:pPr>
         <w:pStyle w:val="Prrafodelista"/>
-        <w:ind w:firstLine="0"/>
-      </w:pPr>
-    </w:p>
-    <w:p>
-      <w:pPr>
-        <w:ind w:firstLine="698"/>
-        <w:jc w:val="left"/>
-      </w:pPr>
-      <w:r>
-        <w:t xml:space="preserve">Para garantizar la reproducibilidad científica exigida en el programa de Magíster, el </w:t>
-      </w:r>
+        <w:numPr>
+          <w:ilvl w:val="0"/>
+          <w:numId w:val="7"/>
+        </w:numPr>
+      </w:pPr>
       <w:r>
         <w:rPr>
           <w:b/>
           <w:bCs/>
         </w:rPr>
-        <w:t>Grupo 6</w:t>
-      </w:r>
-      <w:r>
-        <w:t xml:space="preserve"> implementó una arquitectura de código estructurada y modular. El cuaderno de trabajo </w:t>
-      </w:r>
-      <w:proofErr w:type="spellStart"/>
-      <w:r>
-        <w:t>Jupyter</w:t>
-      </w:r>
-      <w:proofErr w:type="spellEnd"/>
-      <w:r>
-        <w:t xml:space="preserve"> Notebook adjunto fue diseñado de manera lineal, permitiendo que cualquier auditor de datos replique la totalidad del flujo metodológico (carga, cálculo y visualización) de forma cronológica y libre de errores de entorno.</w:t>
-      </w:r>
-    </w:p>
-    <w:p>
-      <w:pPr>
-        <w:ind w:firstLine="698"/>
-        <w:jc w:val="left"/>
-      </w:pPr>
-      <w:r>
-        <w:t xml:space="preserve">Las funciones analíticas críticas empleadas para la inferencia estadística—tales como el cálculo de intervalos de confianza paramétricos mediante la distribución </w:t>
-      </w:r>
-      <w:r>
-        <w:rPr>
-          <w:i/>
-          <w:iCs/>
-        </w:rPr>
-        <w:t>t</w:t>
-      </w:r>
-      <w:r>
-        <w:t xml:space="preserve">-Student y la ejecución de la prueba </w:t>
-      </w:r>
-      <w:r>
-        <w:rPr>
-          <w:i/>
-          <w:iCs/>
-        </w:rPr>
-        <w:t>t</w:t>
-      </w:r>
-      <w:r>
-        <w:t xml:space="preserve"> de Welch para varianzas heterogéneas—fueron encapsuladas de manera externa en </w:t>
-      </w:r>
-      <w:r>
-        <w:lastRenderedPageBreak/>
-        <w:t xml:space="preserve">el módulo local </w:t>
-      </w:r>
-      <w:proofErr w:type="spellStart"/>
+        <w:t>Optimización de Recursos Agrícolas:</w:t>
+      </w:r>
+      <w:r>
+        <w:t xml:space="preserve"> El contraste paramétrico demostró un desplazamiento severo y sistemático de la humedad vespertina en la víspera de precipitaciones, fijando su media muestral en 68.80% frente al 46.51% de los periodos secos. Para la gestión agropecuaria, este indicador físico actúa como un umbral operativo clave para automatizar la suspensión de los ciclos de riego, optimizando el recurso hídrico y reduciendo costos ante la inminencia de un evento pluvial.</w:t>
+      </w:r>
+    </w:p>
+    <w:p>
+      <w:pPr>
+        <w:ind w:left="360" w:firstLine="0"/>
+      </w:pPr>
+    </w:p>
+    <w:p>
+      <w:pPr>
+        <w:pStyle w:val="Prrafodelista"/>
+        <w:numPr>
+          <w:ilvl w:val="0"/>
+          <w:numId w:val="7"/>
+        </w:numPr>
+      </w:pPr>
       <w:r>
         <w:rPr>
           <w:b/>
           <w:bCs/>
-          <w:i/>
-          <w:iCs/>
-        </w:rPr>
-        <w:t>src</w:t>
-      </w:r>
-      <w:proofErr w:type="spellEnd"/>
+        </w:rPr>
+        <w:t>Precisión por Volumen de Datos:</w:t>
+      </w:r>
+      <w:r>
+        <w:t xml:space="preserve"> Los intervalos de confianza al 95% y 99% calculados muestran amplitudes estrechas debidas al tamaño muestral masivo (n &gt; 140,000). Esto reduce de forma drástica el error estándar de estimación, validando que las medias obtenidas por el equipo minimizan la incertidumbre del muestreo y representan con alta precisión estadística las tendencias climáticas latentes para la gestión de cuencas hidrográficas.</w:t>
+      </w:r>
+    </w:p>
+    <w:p>
+      <w:pPr>
+        <w:ind w:left="360" w:firstLine="0"/>
+      </w:pPr>
+    </w:p>
+    <w:p>
+      <w:pPr>
+        <w:pStyle w:val="Prrafodelista"/>
+        <w:numPr>
+          <w:ilvl w:val="0"/>
+          <w:numId w:val="7"/>
+        </w:numPr>
+      </w:pPr>
       <w:r>
         <w:rPr>
           <w:b/>
           <w:bCs/>
-          <w:i/>
-          <w:iCs/>
-        </w:rPr>
-        <w:t>/estadistica_utils.py</w:t>
-      </w:r>
-      <w:r>
-        <w:t>. Esta práctica de ingeniería de software previene la redundancia en el espacio de trabajo principal y asegura la transparencia algorítmica del reporte técnico.</w:t>
-      </w:r>
-    </w:p>
-    <w:p>
-      <w:pPr>
-        <w:ind w:firstLine="698"/>
+        </w:rPr>
+        <w:t>Estrategia de Modelamiento Futuro:</w:t>
+      </w:r>
+      <w:r>
+        <w:t xml:space="preserve"> El desbalance detectado en la variable objetivo RainTomorrow (77.6% frente a 22.4%) y las altas tasas de nulidad natural en sensores de radiación solar (Sunshine con 48.0%), marcan la pauta para la fase sumativa subsiguiente. El modelo predictivo no podrá evaluarse mediante métricas estándar de exactitud (accuracy), exigiendo en su lugar técnicas de imputación robustas y algoritmos de clasificación binaria evaluados de forma estricta mediante curvas ROC-AUC y análisis de sensibilidad.</w:t>
+      </w:r>
+    </w:p>
+    <w:p>
+      <w:pPr>
+        <w:spacing w:after="160" w:line="278" w:lineRule="auto"/>
+        <w:ind w:left="0" w:firstLine="0"/>
         <w:jc w:val="left"/>
       </w:pPr>
-    </w:p>
-    <w:p>
-      <w:pPr>
-        <w:pStyle w:val="Ttulo3"/>
-      </w:pPr>
-      <w:bookmarkStart w:id="7" w:name="_Toc233565149"/>
-      <w:r>
-        <w:t>5</w:t>
-      </w:r>
-      <w:r>
-        <w:t>. Interpretación Preliminar y Conclusiones para la Toma de Decisiones</w:t>
-      </w:r>
-      <w:bookmarkEnd w:id="7"/>
-    </w:p>
-    <w:p>
-      <w:pPr>
-        <w:ind w:firstLine="698"/>
-        <w:jc w:val="left"/>
-      </w:pPr>
-      <w:r>
-        <w:t>El análisis exploratorio e inferencial desarrollado sobre el registro histórico meteorológico de la Commonwealth de Australia provee conclusiones cuantitativas fundamentales para la mitigación del riesgo operativo y la toma de decisiones estratégicas bajo escenarios de alta incertidumbre:</w:t>
-      </w:r>
-    </w:p>
-    <w:p>
-      <w:pPr>
+      <w:r>
+        <w:br w:type="page"/>
+      </w:r>
+    </w:p>
+    <w:p>
+      <w:pPr>
+        <w:pStyle w:val="Ttulo2"/>
         <w:numPr>
           <w:ilvl w:val="0"/>
-          <w:numId w:val="3"/>
+          <w:numId w:val="2"/>
         </w:numPr>
-        <w:jc w:val="left"/>
+      </w:pPr>
+      <w:bookmarkStart w:id="8" w:name="_Toc233745585"/>
+      <w:r>
+        <w:lastRenderedPageBreak/>
+        <w:t>Presentación Formal del Informe</w:t>
+      </w:r>
+      <w:bookmarkEnd w:id="8"/>
+    </w:p>
+    <w:p>
+      <w:pPr>
+        <w:ind w:left="360" w:firstLine="0"/>
+      </w:pPr>
+    </w:p>
+    <w:p>
+      <w:pPr>
+        <w:ind w:left="360" w:firstLine="348"/>
+      </w:pPr>
+      <w:r>
+        <w:t xml:space="preserve">El presente reporte técnico ejecutivo fue redactado rigurosamente bajo un registro académico, cautelando el uso preciso del lenguaje estadístico de postgrado. A lo largo del documento se incorporaron y discutieron conceptos clave de la inferencia computacional, tales como estimación puntual, intervalos de confianza paramétricos, distribuciones asintóticas bajo el Teorema Central del Límite, estadísticos de contraste (t de Welch y χ2), niveles de significancia (α = 0.05), valores p y el tamaño del efecto a través de la d de Cohen. </w:t>
+      </w:r>
+    </w:p>
+    <w:p>
+      <w:pPr>
+        <w:ind w:left="360" w:firstLine="0"/>
+      </w:pPr>
+    </w:p>
+    <w:p>
+      <w:pPr>
+        <w:ind w:left="360" w:firstLine="348"/>
+      </w:pPr>
+      <w:r>
+        <w:t>Para asegurar el cumplimiento metodológico y de formato solicitado por la cátedra, el equipo validó los siguientes criterios de control de calidad antes de la entrega final:</w:t>
+      </w:r>
+    </w:p>
+    <w:p>
+      <w:pPr>
+        <w:ind w:left="360" w:firstLine="0"/>
+      </w:pPr>
+    </w:p>
+    <w:p>
+      <w:pPr>
+        <w:pStyle w:val="Prrafodelista"/>
+        <w:numPr>
+          <w:ilvl w:val="0"/>
+          <w:numId w:val="6"/>
+        </w:numPr>
       </w:pPr>
       <w:r>
         <w:rPr>
           <w:b/>
           <w:bCs/>
         </w:rPr>
-        <w:t>Monitoreo de la Humedad Crítica:</w:t>
-      </w:r>
-      <w:r>
-        <w:t xml:space="preserve"> La prueba de hipótesis paramétrica demostró de forma concluyente que existe un desplazamiento severo y sistemático de la humedad relativa vespertina (</w:t>
-      </w:r>
-      <w:r>
-        <w:rPr>
-          <w:i/>
-          <w:iCs/>
-        </w:rPr>
-        <w:t>Humidity3pm</w:t>
-      </w:r>
-      <w:r>
-        <w:t>) antes de un evento de precipitación, elevando su mediana por encima del 75%. Para los tomadores de decisiones del sector agropecuario, este indicador físico actúa como un biomarcador clave para congelar los ciclos de riego automatizado, optimizando los recursos hídricos y reduciendo costos operativos.</w:t>
-      </w:r>
-    </w:p>
-    <w:p>
-      <w:pPr>
+        <w:t>Estructura y Trazabilidad:</w:t>
+      </w:r>
+      <w:r>
+        <w:t xml:space="preserve"> El informe respeta la jerarquía decimal de la plantilla oficial, vinculando cada afirmación analítica de forma directa con las tablas resumen y las ilustraciones exportadas desde el entorno de desarrollo, corrigiendo los saltos de numeración previa.</w:t>
+      </w:r>
+    </w:p>
+    <w:p>
+      <w:pPr>
+        <w:ind w:left="360" w:firstLine="0"/>
+      </w:pPr>
+    </w:p>
+    <w:p>
+      <w:pPr>
+        <w:pStyle w:val="Prrafodelista"/>
         <w:numPr>
           <w:ilvl w:val="0"/>
-          <w:numId w:val="3"/>
+          <w:numId w:val="6"/>
         </w:numPr>
-        <w:jc w:val="left"/>
       </w:pPr>
       <w:r>
         <w:rPr>
           <w:b/>
           <w:bCs/>
         </w:rPr>
-        <w:t>Precisión Involuntaria por Volumen de Datos:</w:t>
-      </w:r>
-      <w:r>
-        <w:t xml:space="preserve"> Los intervalos de confianza al 95% y 99% calculados para variables termodinámicas básicas muestran amplitudes asintóticamente estrechas. Esto valida que, para la gestión logística de cuencas hidrográficas, los estimadores puntuales obtenidos por el equipo representan con una fidelidad matemática absoluta el comportamiento poblacional latente del clima continental.</w:t>
-      </w:r>
-    </w:p>
-    <w:p>
-      <w:pPr>
+        <w:t>Normalización de Formato:</w:t>
+      </w:r>
+      <w:r>
+        <w:t xml:space="preserve"> Las tablas informáticas fueron adaptadas visualmente bajo los lineamientos de la normativa APA 7.ª edición, eliminando líneas verticales redundantes e incluyendo notas aclaratorias de autoría computacional del Grupo 6.</w:t>
+      </w:r>
+    </w:p>
+    <w:p>
+      <w:pPr>
+        <w:ind w:left="0" w:firstLine="0"/>
+      </w:pPr>
+    </w:p>
+    <w:p>
+      <w:pPr>
+        <w:pStyle w:val="Prrafodelista"/>
         <w:numPr>
           <w:ilvl w:val="0"/>
-          <w:numId w:val="3"/>
+          <w:numId w:val="6"/>
         </w:numPr>
-        <w:jc w:val="left"/>
       </w:pPr>
       <w:r>
         <w:rPr>
           <w:b/>
           <w:bCs/>
         </w:rPr>
-        <w:t>Estrategia para el Modelamiento Futuro:</w:t>
-      </w:r>
-      <w:r>
-        <w:t xml:space="preserve"> El desbalance detectado en la variable objetivo </w:t>
-      </w:r>
-      <w:proofErr w:type="spellStart"/>
-      <w:r>
-        <w:t>RainTomorrow</w:t>
-      </w:r>
-      <w:proofErr w:type="spellEnd"/>
-      <w:r>
-        <w:t xml:space="preserve"> (77.6% frente a 22.4%) y las altas tasas de nulidad natural en sensores de radiación solar (Sunshine), marcan la pauta para la fase sumativa subsiguiente. El modelo predictivo no podrá evaluarse mediante métricas estándar de exactitud, exigiendo en su lugar técnicas de imputación robustas y el uso de algoritmos de clasificación binaria (como regresión logística) optimizados mediante curvas ROC-AUC.</w:t>
-      </w:r>
-    </w:p>
-    <w:p>
-      <w:pPr>
-        <w:jc w:val="left"/>
-      </w:pPr>
-    </w:p>
-    <w:p>
-      <w:pPr>
-        <w:pStyle w:val="Ttulo3"/>
-      </w:pPr>
-      <w:bookmarkStart w:id="8" w:name="_Toc233565150"/>
-      <w:r>
-        <w:t>6</w:t>
-      </w:r>
-      <w:r>
-        <w:t>. Presentación Formal del Informe</w:t>
-      </w:r>
-      <w:bookmarkEnd w:id="8"/>
-    </w:p>
-    <w:p>
-      <w:pPr>
-        <w:ind w:firstLine="698"/>
-        <w:jc w:val="left"/>
-      </w:pPr>
-      <w:r>
-        <w:t>El presente reporte técnico ejecutivo fue redactado rigurosamente bajo un registro formal y académico, cautelando el uso preciso y estricto del lenguaje estadístico de postgrado. A lo largo del documento se incorporaron y discutieron conceptos clave de la inferencia computacional, tales como estimación puntual, intervalos de confianza paramétricos, distribuciones asintóticas bajo el Teorema Central del Límite, estadísticos de contraste (</w:t>
-      </w:r>
-      <w:r>
-        <w:rPr>
-          <w:i/>
-          <w:iCs/>
-        </w:rPr>
-        <w:t>t</w:t>
-      </w:r>
-      <w:r>
-        <w:t xml:space="preserve"> de Welch y </w:t>
-      </w:r>
-      <m:oMath>
-        <m:sSup>
-          <m:sSupPr>
-            <m:ctrlPr>
-              <w:rPr>
-                <w:rFonts w:ascii="Cambria Math" w:hAnsi="Cambria Math"/>
-              </w:rPr>
-            </m:ctrlPr>
-          </m:sSupPr>
-          <m:e>
-            <m:r>
-              <w:rPr>
-                <w:rFonts w:ascii="Cambria Math" w:hAnsi="Cambria Math"/>
-              </w:rPr>
-              <m:t>χ</m:t>
-            </m:r>
-          </m:e>
-          <m:sup>
-            <m:r>
-              <w:rPr>
-                <w:rFonts w:ascii="Cambria Math" w:hAnsi="Cambria Math"/>
-              </w:rPr>
-              <m:t>2</m:t>
-            </m:r>
-          </m:sup>
-        </m:sSup>
-      </m:oMath>
-      <w:r>
-        <w:t>), niveles de significancia (</w:t>
-      </w:r>
-      <w:r>
-        <w:rPr>
-          <w:i/>
-          <w:iCs/>
-        </w:rPr>
-        <w:t>α</w:t>
-      </w:r>
-      <w:r>
-        <w:rPr>
-          <w:i/>
-          <w:iCs/>
-        </w:rPr>
-        <w:t xml:space="preserve"> = 0.05</w:t>
-      </w:r>
-      <w:r>
-        <w:t xml:space="preserve">), valores </w:t>
-      </w:r>
-      <w:r>
-        <w:rPr>
-          <w:i/>
-          <w:iCs/>
-        </w:rPr>
-        <w:t>p</w:t>
-      </w:r>
-      <w:r>
-        <w:t xml:space="preserve">, y el tamaño del efecto a través de la </w:t>
-      </w:r>
-      <w:r>
-        <w:rPr>
-          <w:i/>
-          <w:iCs/>
-        </w:rPr>
-        <w:t>d</w:t>
-      </w:r>
-      <w:r>
-        <w:t xml:space="preserve"> de Cohen. </w:t>
-      </w:r>
-    </w:p>
-    <w:p>
-      <w:pPr>
-        <w:jc w:val="left"/>
-      </w:pPr>
-      <w:r>
-        <w:t xml:space="preserve">Para asegurar el cumplimiento metodológico y de formato solicitado por la cátedra, el equipo validó los siguientes criterios de control de calidad antes de la entrega final: </w:t>
-      </w:r>
-    </w:p>
-    <w:p>
-      <w:pPr>
+        <w:t>Consistencia Informática:</w:t>
+      </w:r>
+      <w:r>
+        <w:t xml:space="preserve"> Se verificó la integridad de los datos del encabezado de la portada institucional y se reparó el enlace al repositorio GitHub, asegurando su correcta operatividad para la auditoría del código fuente modularizado.</w:t>
+      </w:r>
+    </w:p>
+    <w:p>
+      <w:pPr>
+        <w:ind w:left="0" w:firstLine="0"/>
+      </w:pPr>
+    </w:p>
+    <w:p>
+      <w:pPr>
+        <w:pStyle w:val="Prrafodelista"/>
         <w:numPr>
           <w:ilvl w:val="0"/>
-          <w:numId w:val="4"/>
+          <w:numId w:val="6"/>
         </w:numPr>
-        <w:jc w:val="left"/>
       </w:pPr>
       <w:r>
         <w:rPr>
           <w:b/>
           <w:bCs/>
         </w:rPr>
-        <w:t>Estructura y Trazabilidad:</w:t>
-      </w:r>
-      <w:r>
-        <w:t xml:space="preserve"> El informe respeta la jerarquía y numeración decimal de la plantilla oficial, vinculando cada afirmación analítica de forma directa con las tablas resumen y las ilustraciones exportadas desde el entorno de desarrollo. </w:t>
-      </w:r>
-    </w:p>
-    <w:p>
-      <w:pPr>
+        <w:t>Compilación:</w:t>
+      </w:r>
+      <w:r>
+        <w:t xml:space="preserve"> El entregable ha sido compilado y exportado de manera nativa en formato PDF para asegurar la correcta visualización del material gráfico y las ecuaciones matemáticas al momento de su carga en la plataforma Canvas.</w:t>
+      </w:r>
+    </w:p>
+    <w:p>
+      <w:pPr>
+        <w:jc w:val="left"/>
+      </w:pPr>
+    </w:p>
+    <w:p>
+      <w:pPr>
+        <w:jc w:val="left"/>
+      </w:pPr>
+    </w:p>
+    <w:p>
+      <w:pPr>
+        <w:pStyle w:val="Ttulo2"/>
         <w:numPr>
           <w:ilvl w:val="0"/>
-          <w:numId w:val="4"/>
+          <w:numId w:val="2"/>
         </w:numPr>
-        <w:jc w:val="left"/>
-      </w:pPr>
-      <w:r>
-        <w:rPr>
-          <w:b/>
-          <w:bCs/>
-        </w:rPr>
-        <w:t>Normalización de Formato:</w:t>
-      </w:r>
-      <w:r>
-        <w:t xml:space="preserve"> Las tablas informáticas fueron adaptadas visualmente bajo los lineamientos de la normativa APA 7.ª edición, eliminando líneas verticales redundantes e incluyendo notas aclaratorias de autoría computacional. </w:t>
-      </w:r>
-    </w:p>
-    <w:p>
-      <w:pPr>
-        <w:numPr>
-          <w:ilvl w:val="0"/>
-          <w:numId w:val="4"/>
-        </w:numPr>
-        <w:jc w:val="left"/>
-      </w:pPr>
-      <w:r>
-        <w:rPr>
-          <w:b/>
-          <w:bCs/>
-        </w:rPr>
-        <w:lastRenderedPageBreak/>
-        <w:t>Consistencia Informática:</w:t>
-      </w:r>
-      <w:r>
-        <w:t xml:space="preserve"> Se verificó la consistencia de los datos del encabezado de la portada institucional (identificación de los integrantes del Grupo 6, asignatura MCDI501, docente y fecha). Asimismo, se incluyó el enlace al repositorio GitHub donde se aloja el código fuente modularizado. </w:t>
-      </w:r>
-    </w:p>
-    <w:p>
-      <w:pPr>
-        <w:numPr>
-          <w:ilvl w:val="0"/>
-          <w:numId w:val="4"/>
-        </w:numPr>
-        <w:jc w:val="left"/>
-      </w:pPr>
-      <w:r>
-        <w:rPr>
-          <w:b/>
-          <w:bCs/>
-        </w:rPr>
-        <w:t>Compilación:</w:t>
-      </w:r>
-      <w:r>
-        <w:t xml:space="preserve"> El entregable ha sido compilado y exportado de manera nativa en formato PDF para asegurar la correcta visualización del material gráfico y los bloques de ecuaciones matemáticas al momento de su carga en la plataforma </w:t>
-      </w:r>
-      <w:proofErr w:type="spellStart"/>
-      <w:r>
-        <w:t>Canvas</w:t>
-      </w:r>
-      <w:proofErr w:type="spellEnd"/>
-      <w:r>
-        <w:t>.</w:t>
-      </w:r>
-    </w:p>
-    <w:p>
-      <w:pPr>
-        <w:jc w:val="left"/>
-      </w:pPr>
-    </w:p>
-    <w:p>
-      <w:pPr>
-        <w:jc w:val="left"/>
-      </w:pPr>
-    </w:p>
-    <w:p>
-      <w:pPr>
-        <w:pStyle w:val="Ttulo3"/>
         <w:rPr>
           <w:lang w:val="en-US"/>
         </w:rPr>
       </w:pPr>
-      <w:bookmarkStart w:id="9" w:name="_Toc233565151"/>
+      <w:bookmarkStart w:id="9" w:name="_Toc233745586"/>
       <w:r>
         <w:rPr>
           <w:lang w:val="en-US"/>
         </w:rPr>
-        <w:t>7</w:t>
-      </w:r>
-      <w:r>
-        <w:rPr>
-          <w:lang w:val="en-US"/>
-        </w:rPr>
-        <w:t xml:space="preserve">. </w:t>
-      </w:r>
-      <w:proofErr w:type="spellStart"/>
-      <w:r>
-        <w:rPr>
-          <w:lang w:val="en-US"/>
-        </w:rPr>
         <w:t>Bibliografía</w:t>
       </w:r>
       <w:bookmarkEnd w:id="9"/>
-      <w:proofErr w:type="spellEnd"/>
     </w:p>
     <w:p>
       <w:pPr>
@@ -4122,35 +3170,7 @@
         <w:rPr>
           <w:lang w:val="en-US"/>
         </w:rPr>
-        <w:t xml:space="preserve">Virtanen, P., </w:t>
-      </w:r>
-      <w:proofErr w:type="spellStart"/>
-      <w:r>
-        <w:rPr>
-          <w:lang w:val="en-US"/>
-        </w:rPr>
-        <w:t>Gommers</w:t>
-      </w:r>
-      <w:proofErr w:type="spellEnd"/>
-      <w:r>
-        <w:rPr>
-          <w:lang w:val="en-US"/>
-        </w:rPr>
-        <w:t xml:space="preserve">, R., Oliphant, T. E., Haberland, M., Reddy, T., </w:t>
-      </w:r>
-      <w:proofErr w:type="spellStart"/>
-      <w:r>
-        <w:rPr>
-          <w:lang w:val="en-US"/>
-        </w:rPr>
-        <w:t>Cournapeau</w:t>
-      </w:r>
-      <w:proofErr w:type="spellEnd"/>
-      <w:r>
-        <w:rPr>
-          <w:lang w:val="en-US"/>
-        </w:rPr>
-        <w:t xml:space="preserve">, D., ... &amp; SciPy 1.0 Contributors. (2020). SciPy 1.0: Fundamental Algorithms for Scientific Computing in Python. </w:t>
+        <w:t xml:space="preserve">Virtanen, P., Gommers, R., Oliphant, T. E., Haberland, M., Reddy, T., Cournapeau, D., ... &amp; SciPy 1.0 Contributors. (2020). SciPy 1.0: Fundamental Algorithms for Scientific Computing in Python. </w:t>
       </w:r>
       <w:r>
         <w:rPr>
@@ -4214,23 +3234,9 @@
         <w:rPr>
           <w:lang w:val="en-US"/>
         </w:rPr>
-        <w:t xml:space="preserve"> [Conjunto de </w:t>
-      </w:r>
-      <w:proofErr w:type="spellStart"/>
-      <w:r>
-        <w:rPr>
-          <w:lang w:val="en-US"/>
-        </w:rPr>
-        <w:t>datos</w:t>
-      </w:r>
-      <w:proofErr w:type="spellEnd"/>
-      <w:r>
-        <w:rPr>
-          <w:lang w:val="en-US"/>
-        </w:rPr>
-        <w:t xml:space="preserve">]. Kaggle. </w:t>
-      </w:r>
-      <w:hyperlink r:id="rId23" w:tgtFrame="_blank" w:history="1">
+        <w:t xml:space="preserve"> [Conjunto de datos]. Kaggle. </w:t>
+      </w:r>
+      <w:hyperlink r:id="rId20" w:tgtFrame="_blank" w:history="1">
         <w:r>
           <w:rPr>
             <w:rStyle w:val="Hipervnculo"/>
@@ -4255,7 +3261,7 @@
       </w:pPr>
     </w:p>
     <w:sectPr>
-      <w:footerReference w:type="default" r:id="rId24"/>
+      <w:footerReference w:type="default" r:id="rId21"/>
       <w:pgSz w:w="12240" w:h="15840"/>
       <w:pgMar w:top="1417" w:right="1701" w:bottom="1417" w:left="1701" w:header="708" w:footer="708" w:gutter="0"/>
       <w:pgNumType w:start="0"/>
@@ -4519,15 +3525,160 @@
       </w:r>
     </w:p>
   </w:footnote>
+  <w:footnote w:id="1">
+    <w:p>
+      <w:pPr>
+        <w:pStyle w:val="Textonotapie"/>
+        <w:rPr>
+          <w:lang w:val="es-ES"/>
+        </w:rPr>
+      </w:pPr>
+      <w:r>
+        <w:rPr>
+          <w:rStyle w:val="Refdenotaalpie"/>
+        </w:rPr>
+        <w:footnoteRef/>
+      </w:r>
+      <w:r>
+        <w:t xml:space="preserve"> </w:t>
+      </w:r>
+      <w:r>
+        <w:t xml:space="preserve">Una distribución </w:t>
+      </w:r>
+      <w:r>
+        <w:rPr>
+          <w:b/>
+          <w:bCs/>
+        </w:rPr>
+        <w:t>platicúrtica</w:t>
+      </w:r>
+      <w:r>
+        <w:t xml:space="preserve"> es un término estadístico que describe una curva de datos con un pico bajo y colas más ligeras (menos valores extremos) en comparación con una distribución norma</w:t>
+      </w:r>
+    </w:p>
+  </w:footnote>
 </w:footnotes>
 </file>
 
 <file path=word/numbering.xml><?xml version="1.0" encoding="utf-8"?>
 <w:numbering xmlns:wpc="http://schemas.microsoft.com/office/word/2010/wordprocessingCanvas" xmlns:cx="http://schemas.microsoft.com/office/drawing/2014/chartex" xmlns:cx1="http://schemas.microsoft.com/office/drawing/2015/9/8/chartex" xmlns:cx2="http://schemas.microsoft.com/office/drawing/2015/10/21/chartex" xmlns:cx3="http://schemas.microsoft.com/office/drawing/2016/5/9/chartex" xmlns:cx4="http://schemas.microsoft.com/office/drawing/2016/5/10/chartex" xmlns:cx5="http://schemas.microsoft.com/office/drawing/2016/5/11/chartex" xmlns:cx6="http://schemas.microsoft.com/office/drawing/2016/5/12/chartex" xmlns:cx7="http://schemas.microsoft.com/office/drawing/2016/5/13/chartex" xmlns:cx8="http://schemas.microsoft.com/office/drawing/2016/5/14/chartex" xmlns:mc="http://schemas.openxmlformats.org/markup-compatibility/2006" xmlns:aink="http://schemas.microsoft.com/office/drawing/2016/ink" xmlns:am3d="http://schemas.microsoft.com/office/drawing/2017/model3d" xmlns:o="urn:schemas-microsoft-com:office:office" xmlns:oel="http://schemas.microsoft.com/office/2019/extlst" xmlns:r="http://schemas.openxmlformats.org/officeDocument/2006/relationships" xmlns:m="http://schemas.openxmlformats.org/officeDocument/2006/math" xmlns:v="urn:schemas-microsoft-com:vml" xmlns:wp14="http://schemas.microsoft.com/office/word/2010/wordprocessingDrawing" xmlns:wp="http://schemas.openxmlformats.org/drawingml/2006/wordprocessingDrawing" xmlns:w10="urn:schemas-microsoft-com:office:word" xmlns:w="http://schemas.openxmlformats.org/wordprocessingml/2006/main" xmlns:w14="http://schemas.microsoft.com/office/word/2010/wordml" xmlns:w15="http://schemas.microsoft.com/office/word/2012/wordml" xmlns:w16cex="http://schemas.microsoft.com/office/word/2018/wordml/cex" xmlns:w16cid="http://schemas.microsoft.com/office/word/2016/wordml/cid" xmlns:w16="http://schemas.microsoft.com/office/word/2018/wordml" xmlns:w16du="http://schemas.microsoft.com/office/word/2023/wordml/word16du" xmlns:w16sdtdh="http://schemas.microsoft.com/office/word/2020/wordml/sdtdatahash" xmlns:w16sdtfl="http://schemas.microsoft.com/office/word/2024/wordml/sdtformatlock" xmlns:w16se="http://schemas.microsoft.com/office/word/2015/wordml/symex" xmlns:wpg="http://schemas.microsoft.com/office/word/2010/wordprocessingGroup" xmlns:wpi="http://schemas.microsoft.com/office/word/2010/wordprocessingInk" xmlns:wne="http://schemas.microsoft.com/office/word/2006/wordml" xmlns:wps="http://schemas.microsoft.com/office/word/2010/wordprocessingShape" mc:Ignorable="w14 w15 w16se w16cid w16 w16cex w16sdtdh w16sdtfl w16du wp14">
   <w:abstractNum w:abstractNumId="0" w15:restartNumberingAfterBreak="0">
+    <w:nsid w:val="0E853B6B"/>
+    <w:multiLevelType w:val="hybridMultilevel"/>
+    <w:tmpl w:val="86D86D68"/>
+    <w:lvl w:ilvl="0" w:tplc="340A0001">
+      <w:start w:val="1"/>
+      <w:numFmt w:val="bullet"/>
+      <w:lvlText w:val=""/>
+      <w:lvlJc w:val="left"/>
+      <w:pPr>
+        <w:ind w:left="1080" w:hanging="360"/>
+      </w:pPr>
+      <w:rPr>
+        <w:rFonts w:ascii="Symbol" w:hAnsi="Symbol" w:hint="default"/>
+      </w:rPr>
+    </w:lvl>
+    <w:lvl w:ilvl="1" w:tplc="340A0003" w:tentative="1">
+      <w:start w:val="1"/>
+      <w:numFmt w:val="bullet"/>
+      <w:lvlText w:val="o"/>
+      <w:lvlJc w:val="left"/>
+      <w:pPr>
+        <w:ind w:left="1800" w:hanging="360"/>
+      </w:pPr>
+      <w:rPr>
+        <w:rFonts w:ascii="Courier New" w:hAnsi="Courier New" w:cs="Courier New" w:hint="default"/>
+      </w:rPr>
+    </w:lvl>
+    <w:lvl w:ilvl="2" w:tplc="340A0005" w:tentative="1">
+      <w:start w:val="1"/>
+      <w:numFmt w:val="bullet"/>
+      <w:lvlText w:val=""/>
+      <w:lvlJc w:val="left"/>
+      <w:pPr>
+        <w:ind w:left="2520" w:hanging="360"/>
+      </w:pPr>
+      <w:rPr>
+        <w:rFonts w:ascii="Wingdings" w:hAnsi="Wingdings" w:hint="default"/>
+      </w:rPr>
+    </w:lvl>
+    <w:lvl w:ilvl="3" w:tplc="340A0001" w:tentative="1">
+      <w:start w:val="1"/>
+      <w:numFmt w:val="bullet"/>
+      <w:lvlText w:val=""/>
+      <w:lvlJc w:val="left"/>
+      <w:pPr>
+        <w:ind w:left="3240" w:hanging="360"/>
+      </w:pPr>
+      <w:rPr>
+        <w:rFonts w:ascii="Symbol" w:hAnsi="Symbol" w:hint="default"/>
+      </w:rPr>
+    </w:lvl>
+    <w:lvl w:ilvl="4" w:tplc="340A0003" w:tentative="1">
+      <w:start w:val="1"/>
+      <w:numFmt w:val="bullet"/>
+      <w:lvlText w:val="o"/>
+      <w:lvlJc w:val="left"/>
+      <w:pPr>
+        <w:ind w:left="3960" w:hanging="360"/>
+      </w:pPr>
+      <w:rPr>
+        <w:rFonts w:ascii="Courier New" w:hAnsi="Courier New" w:cs="Courier New" w:hint="default"/>
+      </w:rPr>
+    </w:lvl>
+    <w:lvl w:ilvl="5" w:tplc="340A0005" w:tentative="1">
+      <w:start w:val="1"/>
+      <w:numFmt w:val="bullet"/>
+      <w:lvlText w:val=""/>
+      <w:lvlJc w:val="left"/>
+      <w:pPr>
+        <w:ind w:left="4680" w:hanging="360"/>
+      </w:pPr>
+      <w:rPr>
+        <w:rFonts w:ascii="Wingdings" w:hAnsi="Wingdings" w:hint="default"/>
+      </w:rPr>
+    </w:lvl>
+    <w:lvl w:ilvl="6" w:tplc="340A0001" w:tentative="1">
+      <w:start w:val="1"/>
+      <w:numFmt w:val="bullet"/>
+      <w:lvlText w:val=""/>
+      <w:lvlJc w:val="left"/>
+      <w:pPr>
+        <w:ind w:left="5400" w:hanging="360"/>
+      </w:pPr>
+      <w:rPr>
+        <w:rFonts w:ascii="Symbol" w:hAnsi="Symbol" w:hint="default"/>
+      </w:rPr>
+    </w:lvl>
+    <w:lvl w:ilvl="7" w:tplc="340A0003" w:tentative="1">
+      <w:start w:val="1"/>
+      <w:numFmt w:val="bullet"/>
+      <w:lvlText w:val="o"/>
+      <w:lvlJc w:val="left"/>
+      <w:pPr>
+        <w:ind w:left="6120" w:hanging="360"/>
+      </w:pPr>
+      <w:rPr>
+        <w:rFonts w:ascii="Courier New" w:hAnsi="Courier New" w:cs="Courier New" w:hint="default"/>
+      </w:rPr>
+    </w:lvl>
+    <w:lvl w:ilvl="8" w:tplc="340A0005" w:tentative="1">
+      <w:start w:val="1"/>
+      <w:numFmt w:val="bullet"/>
+      <w:lvlText w:val=""/>
+      <w:lvlJc w:val="left"/>
+      <w:pPr>
+        <w:ind w:left="6840" w:hanging="360"/>
+      </w:pPr>
+      <w:rPr>
+        <w:rFonts w:ascii="Wingdings" w:hAnsi="Wingdings" w:hint="default"/>
+      </w:rPr>
+    </w:lvl>
+  </w:abstractNum>
+  <w:abstractNum w:abstractNumId="1" w15:restartNumberingAfterBreak="0">
     <w:nsid w:val="213C3AE0"/>
     <w:multiLevelType w:val="hybridMultilevel"/>
-    <w:tmpl w:val="C4A801E8"/>
+    <w:tmpl w:val="609A5612"/>
     <w:lvl w:ilvl="0" w:tplc="340A000F">
       <w:start w:val="1"/>
       <w:numFmt w:val="decimal"/>
@@ -4613,7 +3764,120 @@
       </w:pPr>
     </w:lvl>
   </w:abstractNum>
-  <w:abstractNum w:abstractNumId="1" w15:restartNumberingAfterBreak="0">
+  <w:abstractNum w:abstractNumId="2" w15:restartNumberingAfterBreak="0">
+    <w:nsid w:val="2985178A"/>
+    <w:multiLevelType w:val="hybridMultilevel"/>
+    <w:tmpl w:val="5AEEEEF8"/>
+    <w:lvl w:ilvl="0" w:tplc="340A0001">
+      <w:start w:val="1"/>
+      <w:numFmt w:val="bullet"/>
+      <w:lvlText w:val=""/>
+      <w:lvlJc w:val="left"/>
+      <w:pPr>
+        <w:ind w:left="1080" w:hanging="360"/>
+      </w:pPr>
+      <w:rPr>
+        <w:rFonts w:ascii="Symbol" w:hAnsi="Symbol" w:hint="default"/>
+      </w:rPr>
+    </w:lvl>
+    <w:lvl w:ilvl="1" w:tplc="340A0003" w:tentative="1">
+      <w:start w:val="1"/>
+      <w:numFmt w:val="bullet"/>
+      <w:lvlText w:val="o"/>
+      <w:lvlJc w:val="left"/>
+      <w:pPr>
+        <w:ind w:left="1800" w:hanging="360"/>
+      </w:pPr>
+      <w:rPr>
+        <w:rFonts w:ascii="Courier New" w:hAnsi="Courier New" w:cs="Courier New" w:hint="default"/>
+      </w:rPr>
+    </w:lvl>
+    <w:lvl w:ilvl="2" w:tplc="340A0005" w:tentative="1">
+      <w:start w:val="1"/>
+      <w:numFmt w:val="bullet"/>
+      <w:lvlText w:val=""/>
+      <w:lvlJc w:val="left"/>
+      <w:pPr>
+        <w:ind w:left="2520" w:hanging="360"/>
+      </w:pPr>
+      <w:rPr>
+        <w:rFonts w:ascii="Wingdings" w:hAnsi="Wingdings" w:hint="default"/>
+      </w:rPr>
+    </w:lvl>
+    <w:lvl w:ilvl="3" w:tplc="340A0001" w:tentative="1">
+      <w:start w:val="1"/>
+      <w:numFmt w:val="bullet"/>
+      <w:lvlText w:val=""/>
+      <w:lvlJc w:val="left"/>
+      <w:pPr>
+        <w:ind w:left="3240" w:hanging="360"/>
+      </w:pPr>
+      <w:rPr>
+        <w:rFonts w:ascii="Symbol" w:hAnsi="Symbol" w:hint="default"/>
+      </w:rPr>
+    </w:lvl>
+    <w:lvl w:ilvl="4" w:tplc="340A0003" w:tentative="1">
+      <w:start w:val="1"/>
+      <w:numFmt w:val="bullet"/>
+      <w:lvlText w:val="o"/>
+      <w:lvlJc w:val="left"/>
+      <w:pPr>
+        <w:ind w:left="3960" w:hanging="360"/>
+      </w:pPr>
+      <w:rPr>
+        <w:rFonts w:ascii="Courier New" w:hAnsi="Courier New" w:cs="Courier New" w:hint="default"/>
+      </w:rPr>
+    </w:lvl>
+    <w:lvl w:ilvl="5" w:tplc="340A0005" w:tentative="1">
+      <w:start w:val="1"/>
+      <w:numFmt w:val="bullet"/>
+      <w:lvlText w:val=""/>
+      <w:lvlJc w:val="left"/>
+      <w:pPr>
+        <w:ind w:left="4680" w:hanging="360"/>
+      </w:pPr>
+      <w:rPr>
+        <w:rFonts w:ascii="Wingdings" w:hAnsi="Wingdings" w:hint="default"/>
+      </w:rPr>
+    </w:lvl>
+    <w:lvl w:ilvl="6" w:tplc="340A0001" w:tentative="1">
+      <w:start w:val="1"/>
+      <w:numFmt w:val="bullet"/>
+      <w:lvlText w:val=""/>
+      <w:lvlJc w:val="left"/>
+      <w:pPr>
+        <w:ind w:left="5400" w:hanging="360"/>
+      </w:pPr>
+      <w:rPr>
+        <w:rFonts w:ascii="Symbol" w:hAnsi="Symbol" w:hint="default"/>
+      </w:rPr>
+    </w:lvl>
+    <w:lvl w:ilvl="7" w:tplc="340A0003" w:tentative="1">
+      <w:start w:val="1"/>
+      <w:numFmt w:val="bullet"/>
+      <w:lvlText w:val="o"/>
+      <w:lvlJc w:val="left"/>
+      <w:pPr>
+        <w:ind w:left="6120" w:hanging="360"/>
+      </w:pPr>
+      <w:rPr>
+        <w:rFonts w:ascii="Courier New" w:hAnsi="Courier New" w:cs="Courier New" w:hint="default"/>
+      </w:rPr>
+    </w:lvl>
+    <w:lvl w:ilvl="8" w:tplc="340A0005" w:tentative="1">
+      <w:start w:val="1"/>
+      <w:numFmt w:val="bullet"/>
+      <w:lvlText w:val=""/>
+      <w:lvlJc w:val="left"/>
+      <w:pPr>
+        <w:ind w:left="6840" w:hanging="360"/>
+      </w:pPr>
+      <w:rPr>
+        <w:rFonts w:ascii="Wingdings" w:hAnsi="Wingdings" w:hint="default"/>
+      </w:rPr>
+    </w:lvl>
+  </w:abstractNum>
+  <w:abstractNum w:abstractNumId="3" w15:restartNumberingAfterBreak="0">
     <w:nsid w:val="2A6E7F1B"/>
     <w:multiLevelType w:val="multilevel"/>
     <w:tmpl w:val="200CE966"/>
@@ -4726,7 +3990,7 @@
       </w:pPr>
     </w:lvl>
   </w:abstractNum>
-  <w:abstractNum w:abstractNumId="2" w15:restartNumberingAfterBreak="0">
+  <w:abstractNum w:abstractNumId="4" w15:restartNumberingAfterBreak="0">
     <w:nsid w:val="351358B2"/>
     <w:multiLevelType w:val="multilevel"/>
     <w:tmpl w:val="C8A4D3C4"/>
@@ -4875,7 +4139,7 @@
       </w:rPr>
     </w:lvl>
   </w:abstractNum>
-  <w:abstractNum w:abstractNumId="3" w15:restartNumberingAfterBreak="0">
+  <w:abstractNum w:abstractNumId="5" w15:restartNumberingAfterBreak="0">
     <w:nsid w:val="50953964"/>
     <w:multiLevelType w:val="hybridMultilevel"/>
     <w:tmpl w:val="8C5E9548"/>
@@ -4964,16 +4228,114 @@
       </w:pPr>
     </w:lvl>
   </w:abstractNum>
+  <w:abstractNum w:abstractNumId="6" w15:restartNumberingAfterBreak="0">
+    <w:nsid w:val="66C97ABC"/>
+    <w:multiLevelType w:val="hybridMultilevel"/>
+    <w:tmpl w:val="1912198A"/>
+    <w:lvl w:ilvl="0" w:tplc="340A000F">
+      <w:start w:val="5"/>
+      <w:numFmt w:val="decimal"/>
+      <w:lvlText w:val="%1."/>
+      <w:lvlJc w:val="left"/>
+      <w:pPr>
+        <w:ind w:left="720" w:hanging="360"/>
+      </w:pPr>
+      <w:rPr>
+        <w:rFonts w:hint="default"/>
+      </w:rPr>
+    </w:lvl>
+    <w:lvl w:ilvl="1" w:tplc="340A0019" w:tentative="1">
+      <w:start w:val="1"/>
+      <w:numFmt w:val="lowerLetter"/>
+      <w:lvlText w:val="%2."/>
+      <w:lvlJc w:val="left"/>
+      <w:pPr>
+        <w:ind w:left="1440" w:hanging="360"/>
+      </w:pPr>
+    </w:lvl>
+    <w:lvl w:ilvl="2" w:tplc="340A001B" w:tentative="1">
+      <w:start w:val="1"/>
+      <w:numFmt w:val="lowerRoman"/>
+      <w:lvlText w:val="%3."/>
+      <w:lvlJc w:val="right"/>
+      <w:pPr>
+        <w:ind w:left="2160" w:hanging="180"/>
+      </w:pPr>
+    </w:lvl>
+    <w:lvl w:ilvl="3" w:tplc="340A000F" w:tentative="1">
+      <w:start w:val="1"/>
+      <w:numFmt w:val="decimal"/>
+      <w:lvlText w:val="%4."/>
+      <w:lvlJc w:val="left"/>
+      <w:pPr>
+        <w:ind w:left="2880" w:hanging="360"/>
+      </w:pPr>
+    </w:lvl>
+    <w:lvl w:ilvl="4" w:tplc="340A0019" w:tentative="1">
+      <w:start w:val="1"/>
+      <w:numFmt w:val="lowerLetter"/>
+      <w:lvlText w:val="%5."/>
+      <w:lvlJc w:val="left"/>
+      <w:pPr>
+        <w:ind w:left="3600" w:hanging="360"/>
+      </w:pPr>
+    </w:lvl>
+    <w:lvl w:ilvl="5" w:tplc="340A001B" w:tentative="1">
+      <w:start w:val="1"/>
+      <w:numFmt w:val="lowerRoman"/>
+      <w:lvlText w:val="%6."/>
+      <w:lvlJc w:val="right"/>
+      <w:pPr>
+        <w:ind w:left="4320" w:hanging="180"/>
+      </w:pPr>
+    </w:lvl>
+    <w:lvl w:ilvl="6" w:tplc="340A000F" w:tentative="1">
+      <w:start w:val="1"/>
+      <w:numFmt w:val="decimal"/>
+      <w:lvlText w:val="%7."/>
+      <w:lvlJc w:val="left"/>
+      <w:pPr>
+        <w:ind w:left="5040" w:hanging="360"/>
+      </w:pPr>
+    </w:lvl>
+    <w:lvl w:ilvl="7" w:tplc="340A0019" w:tentative="1">
+      <w:start w:val="1"/>
+      <w:numFmt w:val="lowerLetter"/>
+      <w:lvlText w:val="%8."/>
+      <w:lvlJc w:val="left"/>
+      <w:pPr>
+        <w:ind w:left="5760" w:hanging="360"/>
+      </w:pPr>
+    </w:lvl>
+    <w:lvl w:ilvl="8" w:tplc="340A001B" w:tentative="1">
+      <w:start w:val="1"/>
+      <w:numFmt w:val="lowerRoman"/>
+      <w:lvlText w:val="%9."/>
+      <w:lvlJc w:val="right"/>
+      <w:pPr>
+        <w:ind w:left="6480" w:hanging="180"/>
+      </w:pPr>
+    </w:lvl>
+  </w:abstractNum>
   <w:num w:numId="1" w16cid:durableId="1445005233">
+    <w:abstractNumId w:val="5"/>
+  </w:num>
+  <w:num w:numId="2" w16cid:durableId="582568930">
+    <w:abstractNumId w:val="1"/>
+  </w:num>
+  <w:num w:numId="3" w16cid:durableId="1068764029">
     <w:abstractNumId w:val="3"/>
   </w:num>
-  <w:num w:numId="2" w16cid:durableId="582568930">
+  <w:num w:numId="4" w16cid:durableId="1578515613">
+    <w:abstractNumId w:val="4"/>
+  </w:num>
+  <w:num w:numId="5" w16cid:durableId="184945043">
+    <w:abstractNumId w:val="6"/>
+  </w:num>
+  <w:num w:numId="6" w16cid:durableId="2146660696">
     <w:abstractNumId w:val="0"/>
   </w:num>
-  <w:num w:numId="3" w16cid:durableId="1068764029">
-    <w:abstractNumId w:val="1"/>
-  </w:num>
-  <w:num w:numId="4" w16cid:durableId="1578515613">
+  <w:num w:numId="7" w16cid:durableId="488596824">
     <w:abstractNumId w:val="2"/>
   </w:num>
 </w:numbering>
@@ -5778,6 +5140,7 @@
       <w:numPr>
         <w:ilvl w:val="1"/>
       </w:numPr>
+      <w:ind w:left="10" w:hanging="10"/>
     </w:pPr>
     <w:rPr>
       <w:rFonts w:eastAsiaTheme="majorEastAsia" w:cstheme="majorBidi"/>
@@ -6026,6 +5389,48 @@
       <w:spacing w:after="100"/>
       <w:ind w:left="440"/>
     </w:pPr>
+  </w:style>
+  <w:style w:type="paragraph" w:styleId="Textonotapie">
+    <w:name w:val="footnote text"/>
+    <w:basedOn w:val="Normal"/>
+    <w:link w:val="TextonotapieCar"/>
+    <w:uiPriority w:val="99"/>
+    <w:semiHidden/>
+    <w:unhideWhenUsed/>
+    <w:rsid w:val="002F25C8"/>
+    <w:pPr>
+      <w:spacing w:after="0" w:line="240" w:lineRule="auto"/>
+    </w:pPr>
+    <w:rPr>
+      <w:sz w:val="20"/>
+      <w:szCs w:val="20"/>
+    </w:rPr>
+  </w:style>
+  <w:style w:type="character" w:customStyle="1" w:styleId="TextonotapieCar">
+    <w:name w:val="Texto nota pie Car"/>
+    <w:basedOn w:val="Fuentedeprrafopredeter"/>
+    <w:link w:val="Textonotapie"/>
+    <w:uiPriority w:val="99"/>
+    <w:semiHidden/>
+    <w:rsid w:val="002F25C8"/>
+    <w:rPr>
+      <w:rFonts w:ascii="Calibri" w:eastAsia="Calibri" w:hAnsi="Calibri" w:cs="Calibri"/>
+      <w:color w:val="000000"/>
+      <w:sz w:val="20"/>
+      <w:szCs w:val="20"/>
+      <w:lang w:eastAsia="es-CL"/>
+    </w:rPr>
+  </w:style>
+  <w:style w:type="character" w:styleId="Refdenotaalpie">
+    <w:name w:val="footnote reference"/>
+    <w:basedOn w:val="Fuentedeprrafopredeter"/>
+    <w:uiPriority w:val="99"/>
+    <w:semiHidden/>
+    <w:unhideWhenUsed/>
+    <w:rsid w:val="002F25C8"/>
+    <w:rPr>
+      <w:vertAlign w:val="superscript"/>
+    </w:rPr>
   </w:style>
 </w:styles>
 </file>

</xml_diff>